<commit_message>
Expand ACC editorial content
</commit_message>
<xml_diff>
--- a/18_DOCX/ACC_FAQ_0001_0005.docx
+++ b/18_DOCX/ACC_FAQ_0001_0005.docx
@@ -216,7 +216,7 @@
         <w:pStyle w:val="Heading3"/>
       </w:pPr>
       <w:r>
-        <w:t>PT-Br</w:t>
+        <w:t>ポルトガル語で伝える内容</w:t>
       </w:r>
     </w:p>
     <w:p>
@@ -229,17 +229,408 @@
         <w:pStyle w:val="Heading3"/>
       </w:pPr>
       <w:r>
-        <w:t>JP（ふりがな）</w:t>
-      </w:r>
-    </w:p>
-    <w:p>
-      <w:r>
-        <w:t>上記のポルトガル語は、お客様に対して、契約確認、書類確認、保険会社の査定が必要であることを短く伝えるための説明です。</w:t>
-      </w:r>
-    </w:p>
-    <w:p>
-      <w:r>
-        <w:t>ふりがな: けいやくかくにん、しょるいかくにん、ほけんがいしゃのさていがひつようであることを、みじかくつたえます。</w:t>
+        <w:t>カタカナ読み</w:t>
+      </w:r>
+    </w:p>
+    <w:p>
+      <w:r>
+        <w:t>セ オ アシデンチ フォイ ノ トラバーリョ、プレシザモス セパラール オ セグーロ ジ アシデンチ ジ トラバーリョ ド セグーロ プリヴァード ジ アシデンチス。ヴァモス ヴェリフィカール セウ コントラト、オス ドクメントス イ オ プロセジメント コヘト アンチス ジ ファラール ソブリ コベルトゥーラ</w:t>
+      </w:r>
+    </w:p>
+    <w:p>
+      <w:r>
+        <w:t>日本語確認用: 上記のポルトガル語は、お客様に対して、契約確認、書類確認、保険会社の査定が必要であることを短く伝えるための説明です。</w:t>
+      </w:r>
+    </w:p>
+    <w:p>
+      <w:pPr>
+        <w:pStyle w:val="Heading2"/>
+      </w:pPr>
+      <w:r>
+        <w:t>安全な次のステップ</w:t>
+      </w:r>
+    </w:p>
+    <w:p>
+      <w:r>
+        <w:t>保険証券、約款、事故日、事故原因、治療記録、診断書または診療明細書、領収書、保険会社指定の請求書類を確認してから案内する。</w:t>
+      </w:r>
+    </w:p>
+    <w:p>
+      <w:pPr>
+        <w:pStyle w:val="Heading2"/>
+      </w:pPr>
+      <w:r>
+        <w:t>コンプライアンス上の注意</w:t>
+      </w:r>
+    </w:p>
+    <w:p>
+      <w:r>
+        <w:t>補償、保険金支払い、労災保険の扱い、医療判断、法的判断、支払金額を断定しない。最終判断は契約条件、提出書類、事故状況、関連制度および保険会社の査定による。</w:t>
+      </w:r>
+    </w:p>
+    <w:p>
+      <w:pPr>
+        <w:pStyle w:val="Heading2"/>
+      </w:pPr>
+      <w:r>
+        <w:t>関連用語</w:t>
+      </w:r>
+    </w:p>
+    <w:p>
+      <w:pPr>
+        <w:pStyle w:val="ListBullet"/>
+      </w:pPr>
+      <w:r>
+        <w:t>ACC-0001 - 傷害保険 - Seguro de acidentes pessoais</w:t>
+      </w:r>
+    </w:p>
+    <w:p>
+      <w:pPr>
+        <w:pStyle w:val="ListBullet"/>
+      </w:pPr>
+      <w:r>
+        <w:t>ACC-0002 - 労災保険 - Seguro de acidente de trabalho</w:t>
+      </w:r>
+    </w:p>
+    <w:p>
+      <w:pPr>
+        <w:pStyle w:val="ListBullet"/>
+      </w:pPr>
+      <w:r>
+        <w:t>ACC-0003 - 通勤災害 - Acidente no trajeto de trabalho</w:t>
+      </w:r>
+    </w:p>
+    <w:p>
+      <w:pPr>
+        <w:pStyle w:val="ListBullet"/>
+      </w:pPr>
+      <w:r>
+        <w:t>ACC-0004 - 事故通知 - Aviso de acidente</w:t>
+      </w:r>
+    </w:p>
+    <w:p>
+      <w:pPr>
+        <w:pStyle w:val="Heading2"/>
+      </w:pPr>
+      <w:r>
+        <w:t>相互参照</w:t>
+      </w:r>
+    </w:p>
+    <w:p>
+      <w:pPr>
+        <w:pStyle w:val="ListBullet"/>
+      </w:pPr>
+      <w:r>
+        <w:t>ACC-0001</w:t>
+      </w:r>
+    </w:p>
+    <w:p>
+      <w:pPr>
+        <w:pStyle w:val="ListBullet"/>
+      </w:pPr>
+      <w:r>
+        <w:t>ACC-0002</w:t>
+      </w:r>
+    </w:p>
+    <w:p>
+      <w:pPr>
+        <w:pStyle w:val="ListBullet"/>
+      </w:pPr>
+      <w:r>
+        <w:t>ACC-0003</w:t>
+      </w:r>
+    </w:p>
+    <w:p>
+      <w:pPr>
+        <w:pStyle w:val="ListBullet"/>
+      </w:pPr>
+      <w:r>
+        <w:t>ACC-0004</w:t>
+      </w:r>
+    </w:p>
+    <w:p>
+      <w:pPr>
+        <w:pStyle w:val="ListBullet"/>
+      </w:pPr>
+      <w:r>
+        <w:t>FAQ-ACC-0001</w:t>
+      </w:r>
+    </w:p>
+    <w:p>
+      <w:pPr>
+        <w:pStyle w:val="Heading2"/>
+      </w:pPr>
+      <w:r>
+        <w:t>参考資料</w:t>
+      </w:r>
+    </w:p>
+    <w:p>
+      <w:pPr>
+        <w:pStyle w:val="ListBullet"/>
+      </w:pPr>
+      <w:r>
+        <w:t>Documento interno: `00_Project/multi_ai_pilot/ACC_FAQ_MULTI_AI_PILOT_REPORT_2026-06-29.md`</w:t>
+      </w:r>
+    </w:p>
+    <w:p>
+      <w:pPr>
+        <w:pStyle w:val="ListBullet"/>
+      </w:pPr>
+      <w:r>
+        <w:t>Fonte pública recomendada: 厚生労働省, 金融庁, 労働局, 保険会社の約款および請求書類</w:t>
+      </w:r>
+    </w:p>
+    <w:p>
+      <w:pPr>
+        <w:pStyle w:val="Heading2"/>
+      </w:pPr>
+      <w:r>
+        <w:t>タグ</w:t>
+      </w:r>
+    </w:p>
+    <w:p>
+      <w:pPr>
+        <w:pStyle w:val="ListBullet"/>
+      </w:pPr>
+      <w:r>
+        <w:t>faq</w:t>
+      </w:r>
+    </w:p>
+    <w:p>
+      <w:pPr>
+        <w:pStyle w:val="ListBullet"/>
+      </w:pPr>
+      <w:r>
+        <w:t>acc</w:t>
+      </w:r>
+    </w:p>
+    <w:p>
+      <w:pPr>
+        <w:pStyle w:val="ListBullet"/>
+      </w:pPr>
+      <w:r>
+        <w:t>atendimento</w:t>
+      </w:r>
+    </w:p>
+    <w:p>
+      <w:pPr>
+        <w:pStyle w:val="ListBullet"/>
+      </w:pPr>
+      <w:r>
+        <w:t>japanese-broker</w:t>
+      </w:r>
+    </w:p>
+    <w:p>
+      <w:pPr>
+        <w:pStyle w:val="ListBullet"/>
+      </w:pPr>
+      <w:r>
+        <w:t>compliance</w:t>
+      </w:r>
+    </w:p>
+    <w:p>
+      <w:pPr>
+        <w:pStyle w:val="Heading2"/>
+      </w:pPr>
+      <w:r>
+        <w:t>関連項目</w:t>
+      </w:r>
+    </w:p>
+    <w:p>
+      <w:pPr>
+        <w:pStyle w:val="ListBullet"/>
+      </w:pPr>
+      <w:r>
+        <w:t>`02_MasterDictionary/ACC/ACC-0001.md`</w:t>
+      </w:r>
+    </w:p>
+    <w:p>
+      <w:pPr>
+        <w:pStyle w:val="ListBullet"/>
+      </w:pPr>
+      <w:r>
+        <w:t>`00_Project/multi_ai_pilot/ACC_FAQ_MULTI_AI_PILOT_REPORT_2026-06-29.md`</w:t>
+      </w:r>
+    </w:p>
+    <w:p>
+      <w:pPr>
+        <w:pStyle w:val="Heading2"/>
+      </w:pPr>
+      <w:r>
+        <w:t>改訂履歴</w:t>
+      </w:r>
+    </w:p>
+    <w:p>
+      <w:r>
+        <w:t>| Data | Versão | Autor | Alteração |</w:t>
+      </w:r>
+    </w:p>
+    <w:p>
+      <w:r>
+        <w:t>| --- | --- | --- | --- |</w:t>
+      </w:r>
+    </w:p>
+    <w:p>
+      <w:r>
+        <w:t>| 2026-06-29 | 0.1 | JP-BR Insurance Knowledge Base | Criação inicial. |</w:t>
+      </w:r>
+    </w:p>
+    <w:p>
+      <w:r>
+        <w:t>---</w:t>
+      </w:r>
+    </w:p>
+    <w:p>
+      <w:pPr>
+        <w:pStyle w:val="Heading1"/>
+      </w:pPr>
+      <w:r>
+        <w:t>FAQ-ACC-0002 - 傷害保険と医療保険の違いをどう説明しますか</w:t>
+      </w:r>
+    </w:p>
+    <w:p>
+      <w:pPr>
+        <w:pStyle w:val="Heading2"/>
+      </w:pPr>
+      <w:r>
+        <w:t>管理情報</w:t>
+      </w:r>
+    </w:p>
+    <w:p>
+      <w:pPr>
+        <w:pStyle w:val="ListBullet"/>
+      </w:pPr>
+      <w:r>
+        <w:t>Versão: 0.1</w:t>
+      </w:r>
+    </w:p>
+    <w:p>
+      <w:pPr>
+        <w:pStyle w:val="ListBullet"/>
+      </w:pPr>
+      <w:r>
+        <w:t>Data: 2026-06-29</w:t>
+      </w:r>
+    </w:p>
+    <w:p>
+      <w:pPr>
+        <w:pStyle w:val="ListBullet"/>
+      </w:pPr>
+      <w:r>
+        <w:t>Autor: JP-BR Insurance Knowledge Base</w:t>
+      </w:r>
+    </w:p>
+    <w:p>
+      <w:pPr>
+        <w:pStyle w:val="ListBullet"/>
+      </w:pPr>
+      <w:r>
+        <w:t>Histórico: Criação inicial a partir do piloto multi-IA ACC, com remoção de romaji e revisão de compliance.</w:t>
+      </w:r>
+    </w:p>
+    <w:p>
+      <w:pPr>
+        <w:pStyle w:val="Heading2"/>
+      </w:pPr>
+      <w:r>
+        <w:t>コード</w:t>
+      </w:r>
+    </w:p>
+    <w:p>
+      <w:r>
+        <w:t>FAQ-ACC-0002</w:t>
+      </w:r>
+    </w:p>
+    <w:p>
+      <w:pPr>
+        <w:pStyle w:val="Heading2"/>
+      </w:pPr>
+      <w:r>
+        <w:t>カテゴリー</w:t>
+      </w:r>
+    </w:p>
+    <w:p>
+      <w:r>
+        <w:t>ACC</w:t>
+      </w:r>
+    </w:p>
+    <w:p>
+      <w:pPr>
+        <w:pStyle w:val="Heading2"/>
+      </w:pPr>
+      <w:r>
+        <w:t>質問</w:t>
+      </w:r>
+    </w:p>
+    <w:p>
+      <w:r>
+        <w:t>傷害保険と医療保険の違いをどう説明しますか</w:t>
+      </w:r>
+    </w:p>
+    <w:p>
+      <w:pPr>
+        <w:pStyle w:val="Heading2"/>
+      </w:pPr>
+      <w:r>
+        <w:t>日本語での自然な検索</w:t>
+      </w:r>
+    </w:p>
+    <w:p>
+      <w:pPr>
+        <w:pStyle w:val="ListBullet"/>
+      </w:pPr>
+      <w:r>
+        <w:t>傷害保険と医療保険の違いをどう説明しますか</w:t>
+      </w:r>
+    </w:p>
+    <w:p>
+      <w:pPr>
+        <w:pStyle w:val="ListBullet"/>
+      </w:pPr>
+      <w:r>
+        <w:t>ブラジル人のお客様に事故保険をどう説明しますか。</w:t>
+      </w:r>
+    </w:p>
+    <w:p>
+      <w:pPr>
+        <w:pStyle w:val="ListBullet"/>
+      </w:pPr>
+      <w:r>
+        <w:t>傷害保険の相談で支払可否を断定しない説明はどうしますか。</w:t>
+      </w:r>
+    </w:p>
+    <w:p>
+      <w:pPr>
+        <w:pStyle w:val="Heading2"/>
+      </w:pPr>
+      <w:r>
+        <w:t>対応場面</w:t>
+      </w:r>
+    </w:p>
+    <w:p>
+      <w:r>
+        <w:t>ブラジル人のお客様が「Qual é a diferença entre seguro de acidente e seguro médico?」と質問しており、事故原因、契約条件、必要書類、公的制度、民間保険、支払可否の違いを確認する場面。</w:t>
+      </w:r>
+    </w:p>
+    <w:p>
+      <w:pPr>
+        <w:pStyle w:val="Heading2"/>
+      </w:pPr>
+      <w:r>
+        <w:t>技術的回答</w:t>
+      </w:r>
+    </w:p>
+    <w:p>
+      <w:r>
+        <w:t>傷害保険は、急激・偶然・外来の事故によるけがを中心に確認する保険です。医療保険は、病気や治療、入院、手術などを契約条件に沿って確認する保険です。事故か病気か、どの契約か、どの給付条件かを分けて案内する必要があります。</w:t>
+      </w:r>
+    </w:p>
+    <w:p>
+      <w:pPr>
+        <w:pStyle w:val="Heading2"/>
+      </w:pPr>
+      <w:r>
+        <w:t>ブラジル人顧客への回答</w:t>
       </w:r>
     </w:p>
     <w:p>
@@ -247,12 +638,30 @@
         <w:pStyle w:val="Heading3"/>
       </w:pPr>
       <w:r>
-        <w:t>Leitura de apoio para o corretor</w:t>
-      </w:r>
-    </w:p>
-    <w:p>
-      <w:r>
-        <w:t>セ オ アシデンチ フォイ ノ トラバーリョ、プレシザモス セパラール オ セグーロ ジ アシデンチ ジ トラバーリョ ド セグーロ プリヴァード ジ アシデンチス。ヴァモス ヴェリフィカール セウ コントラト、オス ドクメントス イ オ プロセジメント コヘト アンチス ジ ファラール ソブリ コベルトゥーラ</w:t>
+        <w:t>ポルトガル語で伝える内容</w:t>
+      </w:r>
+    </w:p>
+    <w:p>
+      <w:r>
+        <w:t>O seguro de acidente é voltado para ferimentos causados por acidente. O seguro médico trata de doença, internação ou cirurgia conforme o contrato. Vamos separar a causa e verificar qual seguro se aplica.</w:t>
+      </w:r>
+    </w:p>
+    <w:p>
+      <w:pPr>
+        <w:pStyle w:val="Heading3"/>
+      </w:pPr>
+      <w:r>
+        <w:t>カタカナ読み</w:t>
+      </w:r>
+    </w:p>
+    <w:p>
+      <w:r>
+        <w:t>オ セグーロ ジ アシデンチ エ ヴォウタード パラ フェリメントス カウザードス ポル アシデンチ。オ セグーロ メジコ トラタ ジ ドエンサ、インテルナサォン オウ シルルジア コンフォルミ オ コントラト。ヴァモス セパラール ア カウザ イ ヴェリフィカール クアウ セグーロ セ アプリカ</w:t>
+      </w:r>
+    </w:p>
+    <w:p>
+      <w:r>
+        <w:t>日本語確認用: 上記のポルトガル語は、お客様に対して、契約確認、書類確認、保険会社の査定が必要であることを短く伝えるための説明です。</w:t>
       </w:r>
     </w:p>
     <w:p>
@@ -302,7 +711,15 @@
         <w:pStyle w:val="ListBullet"/>
       </w:pPr>
       <w:r>
-        <w:t>ACC-0002 - 労災保険 - Seguro de acidente de trabalho</w:t>
+        <w:t>MED-0001 - 医療保険 - Seguro médico</w:t>
+      </w:r>
+    </w:p>
+    <w:p>
+      <w:pPr>
+        <w:pStyle w:val="Heading2"/>
+      </w:pPr>
+      <w:r>
+        <w:t>相互参照</w:t>
       </w:r>
     </w:p>
     <w:p>
@@ -310,7 +727,7 @@
         <w:pStyle w:val="ListBullet"/>
       </w:pPr>
       <w:r>
-        <w:t>ACC-0003 - 通勤災害 - Acidente no trajeto de trabalho</w:t>
+        <w:t>ACC-0001</w:t>
       </w:r>
     </w:p>
     <w:p>
@@ -318,11 +735,807 @@
         <w:pStyle w:val="ListBullet"/>
       </w:pPr>
       <w:r>
+        <w:t>MED-0001</w:t>
+      </w:r>
+    </w:p>
+    <w:p>
+      <w:pPr>
+        <w:pStyle w:val="ListBullet"/>
+      </w:pPr>
+      <w:r>
+        <w:t>FAQ-ACC-0002</w:t>
+      </w:r>
+    </w:p>
+    <w:p>
+      <w:pPr>
+        <w:pStyle w:val="Heading2"/>
+      </w:pPr>
+      <w:r>
+        <w:t>参考資料</w:t>
+      </w:r>
+    </w:p>
+    <w:p>
+      <w:pPr>
+        <w:pStyle w:val="ListBullet"/>
+      </w:pPr>
+      <w:r>
+        <w:t>Documento interno: `00_Project/multi_ai_pilot/ACC_FAQ_MULTI_AI_PILOT_REPORT_2026-06-29.md`</w:t>
+      </w:r>
+    </w:p>
+    <w:p>
+      <w:pPr>
+        <w:pStyle w:val="ListBullet"/>
+      </w:pPr>
+      <w:r>
+        <w:t>Fonte pública recomendada: 厚生労働省, 金融庁, 労働局, 保険会社の約款および請求書類</w:t>
+      </w:r>
+    </w:p>
+    <w:p>
+      <w:pPr>
+        <w:pStyle w:val="Heading2"/>
+      </w:pPr>
+      <w:r>
+        <w:t>タグ</w:t>
+      </w:r>
+    </w:p>
+    <w:p>
+      <w:pPr>
+        <w:pStyle w:val="ListBullet"/>
+      </w:pPr>
+      <w:r>
+        <w:t>faq</w:t>
+      </w:r>
+    </w:p>
+    <w:p>
+      <w:pPr>
+        <w:pStyle w:val="ListBullet"/>
+      </w:pPr>
+      <w:r>
+        <w:t>acc</w:t>
+      </w:r>
+    </w:p>
+    <w:p>
+      <w:pPr>
+        <w:pStyle w:val="ListBullet"/>
+      </w:pPr>
+      <w:r>
+        <w:t>atendimento</w:t>
+      </w:r>
+    </w:p>
+    <w:p>
+      <w:pPr>
+        <w:pStyle w:val="ListBullet"/>
+      </w:pPr>
+      <w:r>
+        <w:t>japanese-broker</w:t>
+      </w:r>
+    </w:p>
+    <w:p>
+      <w:pPr>
+        <w:pStyle w:val="ListBullet"/>
+      </w:pPr>
+      <w:r>
+        <w:t>compliance</w:t>
+      </w:r>
+    </w:p>
+    <w:p>
+      <w:pPr>
+        <w:pStyle w:val="Heading2"/>
+      </w:pPr>
+      <w:r>
+        <w:t>関連項目</w:t>
+      </w:r>
+    </w:p>
+    <w:p>
+      <w:pPr>
+        <w:pStyle w:val="ListBullet"/>
+      </w:pPr>
+      <w:r>
+        <w:t>`02_MasterDictionary/ACC/ACC-0001.md`</w:t>
+      </w:r>
+    </w:p>
+    <w:p>
+      <w:pPr>
+        <w:pStyle w:val="ListBullet"/>
+      </w:pPr>
+      <w:r>
+        <w:t>`00_Project/multi_ai_pilot/ACC_FAQ_MULTI_AI_PILOT_REPORT_2026-06-29.md`</w:t>
+      </w:r>
+    </w:p>
+    <w:p>
+      <w:pPr>
+        <w:pStyle w:val="Heading2"/>
+      </w:pPr>
+      <w:r>
+        <w:t>改訂履歴</w:t>
+      </w:r>
+    </w:p>
+    <w:p>
+      <w:r>
+        <w:t>| Data | Versão | Autor | Alteração |</w:t>
+      </w:r>
+    </w:p>
+    <w:p>
+      <w:r>
+        <w:t>| --- | --- | --- | --- |</w:t>
+      </w:r>
+    </w:p>
+    <w:p>
+      <w:r>
+        <w:t>| 2026-06-29 | 0.1 | JP-BR Insurance Knowledge Base | Criação inicial. |</w:t>
+      </w:r>
+    </w:p>
+    <w:p>
+      <w:r>
+        <w:t>---</w:t>
+      </w:r>
+    </w:p>
+    <w:p>
+      <w:pPr>
+        <w:pStyle w:val="Heading1"/>
+      </w:pPr>
+      <w:r>
+        <w:t>FAQ-ACC-0003 - 事故による骨折では何を確認しますか</w:t>
+      </w:r>
+    </w:p>
+    <w:p>
+      <w:pPr>
+        <w:pStyle w:val="Heading2"/>
+      </w:pPr>
+      <w:r>
+        <w:t>管理情報</w:t>
+      </w:r>
+    </w:p>
+    <w:p>
+      <w:pPr>
+        <w:pStyle w:val="ListBullet"/>
+      </w:pPr>
+      <w:r>
+        <w:t>Versão: 0.1</w:t>
+      </w:r>
+    </w:p>
+    <w:p>
+      <w:pPr>
+        <w:pStyle w:val="ListBullet"/>
+      </w:pPr>
+      <w:r>
+        <w:t>Data: 2026-06-29</w:t>
+      </w:r>
+    </w:p>
+    <w:p>
+      <w:pPr>
+        <w:pStyle w:val="ListBullet"/>
+      </w:pPr>
+      <w:r>
+        <w:t>Autor: JP-BR Insurance Knowledge Base</w:t>
+      </w:r>
+    </w:p>
+    <w:p>
+      <w:pPr>
+        <w:pStyle w:val="ListBullet"/>
+      </w:pPr>
+      <w:r>
+        <w:t>Histórico: Criação inicial a partir do piloto multi-IA ACC, com remoção de romaji e revisão de compliance.</w:t>
+      </w:r>
+    </w:p>
+    <w:p>
+      <w:pPr>
+        <w:pStyle w:val="Heading2"/>
+      </w:pPr>
+      <w:r>
+        <w:t>コード</w:t>
+      </w:r>
+    </w:p>
+    <w:p>
+      <w:r>
+        <w:t>FAQ-ACC-0003</w:t>
+      </w:r>
+    </w:p>
+    <w:p>
+      <w:pPr>
+        <w:pStyle w:val="Heading2"/>
+      </w:pPr>
+      <w:r>
+        <w:t>カテゴリー</w:t>
+      </w:r>
+    </w:p>
+    <w:p>
+      <w:r>
+        <w:t>ACC</w:t>
+      </w:r>
+    </w:p>
+    <w:p>
+      <w:pPr>
+        <w:pStyle w:val="Heading2"/>
+      </w:pPr>
+      <w:r>
+        <w:t>質問</w:t>
+      </w:r>
+    </w:p>
+    <w:p>
+      <w:r>
+        <w:t>事故による骨折では何を確認しますか</w:t>
+      </w:r>
+    </w:p>
+    <w:p>
+      <w:pPr>
+        <w:pStyle w:val="Heading2"/>
+      </w:pPr>
+      <w:r>
+        <w:t>日本語での自然な検索</w:t>
+      </w:r>
+    </w:p>
+    <w:p>
+      <w:pPr>
+        <w:pStyle w:val="ListBullet"/>
+      </w:pPr>
+      <w:r>
+        <w:t>事故による骨折では何を確認しますか</w:t>
+      </w:r>
+    </w:p>
+    <w:p>
+      <w:pPr>
+        <w:pStyle w:val="ListBullet"/>
+      </w:pPr>
+      <w:r>
+        <w:t>ブラジル人のお客様に事故保険をどう説明しますか。</w:t>
+      </w:r>
+    </w:p>
+    <w:p>
+      <w:pPr>
+        <w:pStyle w:val="ListBullet"/>
+      </w:pPr>
+      <w:r>
+        <w:t>傷害保険の相談で支払可否を断定しない説明はどうしますか。</w:t>
+      </w:r>
+    </w:p>
+    <w:p>
+      <w:pPr>
+        <w:pStyle w:val="Heading2"/>
+      </w:pPr>
+      <w:r>
+        <w:t>対応場面</w:t>
+      </w:r>
+    </w:p>
+    <w:p>
+      <w:r>
+        <w:t>ブラジル人のお客様が「Quebrei um osso em um acidente. O que preciso confirmar?」と質問しており、事故原因、契約条件、必要書類、公的制度、民間保険、支払可否の違いを確認する場面。</w:t>
+      </w:r>
+    </w:p>
+    <w:p>
+      <w:pPr>
+        <w:pStyle w:val="Heading2"/>
+      </w:pPr>
+      <w:r>
+        <w:t>技術的回答</w:t>
+      </w:r>
+    </w:p>
+    <w:p>
+      <w:r>
+        <w:t>事故による骨折は傷害保険の確認対象となりえますが、事故性、診断内容、治療内容、入院・通院・手術の有無、必要書類、契約条件を確認する必要があります。既往症や体質が影響する場合は、保険会社の査定で取り扱いが変わる可能性があります。</w:t>
+      </w:r>
+    </w:p>
+    <w:p>
+      <w:pPr>
+        <w:pStyle w:val="Heading2"/>
+      </w:pPr>
+      <w:r>
+        <w:t>ブラジル人顧客への回答</w:t>
+      </w:r>
+    </w:p>
+    <w:p>
+      <w:pPr>
+        <w:pStyle w:val="Heading3"/>
+      </w:pPr>
+      <w:r>
+        <w:t>ポルトガル語で伝える内容</w:t>
+      </w:r>
+    </w:p>
+    <w:p>
+      <w:r>
+        <w:t>Fratura causada por acidente pode ser analisada pelo seguro de acidentes, mas precisamos confirmar o contrato, o diagnóstico, os documentos e se houve internação, cirurgia ou tratamento ambulatorial. A seguradora fará a análise final.</w:t>
+      </w:r>
+    </w:p>
+    <w:p>
+      <w:pPr>
+        <w:pStyle w:val="Heading3"/>
+      </w:pPr>
+      <w:r>
+        <w:t>カタカナ読み</w:t>
+      </w:r>
+    </w:p>
+    <w:p>
+      <w:r>
+        <w:t>フラトゥーラ カウザーダ ポル アシデンチ ポジ セール アナリザーダ ペロ セグーロ ジ アシデンチス、マス プレシザモス コンフィルマール オ コントラト、オ ジアグノスチコ、オス ドクメントス イ セ オウヴィ インテルナサォン、シルルジア オウ トラタメント アンブラトリアウ。ア セグラドーラ ファラ ア アナリジ フィナウ</w:t>
+      </w:r>
+    </w:p>
+    <w:p>
+      <w:r>
+        <w:t>日本語確認用: 上記のポルトガル語は、お客様に対して、契約確認、書類確認、保険会社の査定が必要であることを短く伝えるための説明です。</w:t>
+      </w:r>
+    </w:p>
+    <w:p>
+      <w:pPr>
+        <w:pStyle w:val="Heading2"/>
+      </w:pPr>
+      <w:r>
+        <w:t>安全な次のステップ</w:t>
+      </w:r>
+    </w:p>
+    <w:p>
+      <w:r>
+        <w:t>保険証券、約款、事故日、事故原因、治療記録、診断書または診療明細書、領収書、保険会社指定の請求書類を確認してから案内する。</w:t>
+      </w:r>
+    </w:p>
+    <w:p>
+      <w:pPr>
+        <w:pStyle w:val="Heading2"/>
+      </w:pPr>
+      <w:r>
+        <w:t>コンプライアンス上の注意</w:t>
+      </w:r>
+    </w:p>
+    <w:p>
+      <w:r>
+        <w:t>補償、保険金支払い、労災保険の扱い、医療判断、法的判断、支払金額を断定しない。最終判断は契約条件、提出書類、事故状況、関連制度および保険会社の査定による。</w:t>
+      </w:r>
+    </w:p>
+    <w:p>
+      <w:pPr>
+        <w:pStyle w:val="Heading2"/>
+      </w:pPr>
+      <w:r>
+        <w:t>関連用語</w:t>
+      </w:r>
+    </w:p>
+    <w:p>
+      <w:pPr>
+        <w:pStyle w:val="ListBullet"/>
+      </w:pPr>
+      <w:r>
+        <w:t>ACC-0001 - 傷害保険 - Seguro de acidentes pessoais</w:t>
+      </w:r>
+    </w:p>
+    <w:p>
+      <w:pPr>
+        <w:pStyle w:val="ListBullet"/>
+      </w:pPr>
+      <w:r>
+        <w:t>ACC-0005 - 診断書 - Atestado médico</w:t>
+      </w:r>
+    </w:p>
+    <w:p>
+      <w:pPr>
+        <w:pStyle w:val="ListBullet"/>
+      </w:pPr>
+      <w:r>
+        <w:t>ACC-0006 - 診療明細書 - Detalhamento do atendimento médico</w:t>
+      </w:r>
+    </w:p>
+    <w:p>
+      <w:pPr>
+        <w:pStyle w:val="ListBullet"/>
+      </w:pPr>
+      <w:r>
+        <w:t>ACC-0008 - 手術保険金 - Benefício por cirurgia causada por acidente</w:t>
+      </w:r>
+    </w:p>
+    <w:p>
+      <w:pPr>
+        <w:pStyle w:val="Heading2"/>
+      </w:pPr>
+      <w:r>
+        <w:t>相互参照</w:t>
+      </w:r>
+    </w:p>
+    <w:p>
+      <w:pPr>
+        <w:pStyle w:val="ListBullet"/>
+      </w:pPr>
+      <w:r>
+        <w:t>ACC-0001</w:t>
+      </w:r>
+    </w:p>
+    <w:p>
+      <w:pPr>
+        <w:pStyle w:val="ListBullet"/>
+      </w:pPr>
+      <w:r>
+        <w:t>ACC-0005</w:t>
+      </w:r>
+    </w:p>
+    <w:p>
+      <w:pPr>
+        <w:pStyle w:val="ListBullet"/>
+      </w:pPr>
+      <w:r>
+        <w:t>ACC-0006</w:t>
+      </w:r>
+    </w:p>
+    <w:p>
+      <w:pPr>
+        <w:pStyle w:val="ListBullet"/>
+      </w:pPr>
+      <w:r>
+        <w:t>ACC-0008</w:t>
+      </w:r>
+    </w:p>
+    <w:p>
+      <w:pPr>
+        <w:pStyle w:val="ListBullet"/>
+      </w:pPr>
+      <w:r>
+        <w:t>FAQ-ACC-0003</w:t>
+      </w:r>
+    </w:p>
+    <w:p>
+      <w:pPr>
+        <w:pStyle w:val="Heading2"/>
+      </w:pPr>
+      <w:r>
+        <w:t>参考資料</w:t>
+      </w:r>
+    </w:p>
+    <w:p>
+      <w:pPr>
+        <w:pStyle w:val="ListBullet"/>
+      </w:pPr>
+      <w:r>
+        <w:t>Documento interno: `00_Project/multi_ai_pilot/ACC_FAQ_MULTI_AI_PILOT_REPORT_2026-06-29.md`</w:t>
+      </w:r>
+    </w:p>
+    <w:p>
+      <w:pPr>
+        <w:pStyle w:val="ListBullet"/>
+      </w:pPr>
+      <w:r>
+        <w:t>Fonte pública recomendada: 厚生労働省, 金融庁, 労働局, 保険会社の約款および請求書類</w:t>
+      </w:r>
+    </w:p>
+    <w:p>
+      <w:pPr>
+        <w:pStyle w:val="Heading2"/>
+      </w:pPr>
+      <w:r>
+        <w:t>タグ</w:t>
+      </w:r>
+    </w:p>
+    <w:p>
+      <w:pPr>
+        <w:pStyle w:val="ListBullet"/>
+      </w:pPr>
+      <w:r>
+        <w:t>faq</w:t>
+      </w:r>
+    </w:p>
+    <w:p>
+      <w:pPr>
+        <w:pStyle w:val="ListBullet"/>
+      </w:pPr>
+      <w:r>
+        <w:t>acc</w:t>
+      </w:r>
+    </w:p>
+    <w:p>
+      <w:pPr>
+        <w:pStyle w:val="ListBullet"/>
+      </w:pPr>
+      <w:r>
+        <w:t>atendimento</w:t>
+      </w:r>
+    </w:p>
+    <w:p>
+      <w:pPr>
+        <w:pStyle w:val="ListBullet"/>
+      </w:pPr>
+      <w:r>
+        <w:t>japanese-broker</w:t>
+      </w:r>
+    </w:p>
+    <w:p>
+      <w:pPr>
+        <w:pStyle w:val="ListBullet"/>
+      </w:pPr>
+      <w:r>
+        <w:t>compliance</w:t>
+      </w:r>
+    </w:p>
+    <w:p>
+      <w:pPr>
+        <w:pStyle w:val="Heading2"/>
+      </w:pPr>
+      <w:r>
+        <w:t>関連項目</w:t>
+      </w:r>
+    </w:p>
+    <w:p>
+      <w:pPr>
+        <w:pStyle w:val="ListBullet"/>
+      </w:pPr>
+      <w:r>
+        <w:t>`02_MasterDictionary/ACC/ACC-0001.md`</w:t>
+      </w:r>
+    </w:p>
+    <w:p>
+      <w:pPr>
+        <w:pStyle w:val="ListBullet"/>
+      </w:pPr>
+      <w:r>
+        <w:t>`00_Project/multi_ai_pilot/ACC_FAQ_MULTI_AI_PILOT_REPORT_2026-06-29.md`</w:t>
+      </w:r>
+    </w:p>
+    <w:p>
+      <w:pPr>
+        <w:pStyle w:val="Heading2"/>
+      </w:pPr>
+      <w:r>
+        <w:t>改訂履歴</w:t>
+      </w:r>
+    </w:p>
+    <w:p>
+      <w:r>
+        <w:t>| Data | Versão | Autor | Alteração |</w:t>
+      </w:r>
+    </w:p>
+    <w:p>
+      <w:r>
+        <w:t>| --- | --- | --- | --- |</w:t>
+      </w:r>
+    </w:p>
+    <w:p>
+      <w:r>
+        <w:t>| 2026-06-29 | 0.1 | JP-BR Insurance Knowledge Base | Criação inicial. |</w:t>
+      </w:r>
+    </w:p>
+    <w:p>
+      <w:r>
+        <w:t>---</w:t>
+      </w:r>
+    </w:p>
+    <w:p>
+      <w:pPr>
+        <w:pStyle w:val="Heading1"/>
+      </w:pPr>
+      <w:r>
+        <w:t>FAQ-ACC-0004 - 事故保険の請求に必要な書類は何ですか</w:t>
+      </w:r>
+    </w:p>
+    <w:p>
+      <w:pPr>
+        <w:pStyle w:val="Heading2"/>
+      </w:pPr>
+      <w:r>
+        <w:t>管理情報</w:t>
+      </w:r>
+    </w:p>
+    <w:p>
+      <w:pPr>
+        <w:pStyle w:val="ListBullet"/>
+      </w:pPr>
+      <w:r>
+        <w:t>Versão: 0.1</w:t>
+      </w:r>
+    </w:p>
+    <w:p>
+      <w:pPr>
+        <w:pStyle w:val="ListBullet"/>
+      </w:pPr>
+      <w:r>
+        <w:t>Data: 2026-06-29</w:t>
+      </w:r>
+    </w:p>
+    <w:p>
+      <w:pPr>
+        <w:pStyle w:val="ListBullet"/>
+      </w:pPr>
+      <w:r>
+        <w:t>Autor: JP-BR Insurance Knowledge Base</w:t>
+      </w:r>
+    </w:p>
+    <w:p>
+      <w:pPr>
+        <w:pStyle w:val="ListBullet"/>
+      </w:pPr>
+      <w:r>
+        <w:t>Histórico: Criação inicial a partir do piloto multi-IA ACC, com remoção de romaji e revisão de compliance.</w:t>
+      </w:r>
+    </w:p>
+    <w:p>
+      <w:pPr>
+        <w:pStyle w:val="Heading2"/>
+      </w:pPr>
+      <w:r>
+        <w:t>コード</w:t>
+      </w:r>
+    </w:p>
+    <w:p>
+      <w:r>
+        <w:t>FAQ-ACC-0004</w:t>
+      </w:r>
+    </w:p>
+    <w:p>
+      <w:pPr>
+        <w:pStyle w:val="Heading2"/>
+      </w:pPr>
+      <w:r>
+        <w:t>カテゴリー</w:t>
+      </w:r>
+    </w:p>
+    <w:p>
+      <w:r>
+        <w:t>ACC</w:t>
+      </w:r>
+    </w:p>
+    <w:p>
+      <w:pPr>
+        <w:pStyle w:val="Heading2"/>
+      </w:pPr>
+      <w:r>
+        <w:t>質問</w:t>
+      </w:r>
+    </w:p>
+    <w:p>
+      <w:r>
+        <w:t>事故保険の請求に必要な書類は何ですか</w:t>
+      </w:r>
+    </w:p>
+    <w:p>
+      <w:pPr>
+        <w:pStyle w:val="Heading2"/>
+      </w:pPr>
+      <w:r>
+        <w:t>日本語での自然な検索</w:t>
+      </w:r>
+    </w:p>
+    <w:p>
+      <w:pPr>
+        <w:pStyle w:val="ListBullet"/>
+      </w:pPr>
+      <w:r>
+        <w:t>事故保険の請求に必要な書類は何ですか</w:t>
+      </w:r>
+    </w:p>
+    <w:p>
+      <w:pPr>
+        <w:pStyle w:val="ListBullet"/>
+      </w:pPr>
+      <w:r>
+        <w:t>ブラジル人のお客様に事故保険をどう説明しますか。</w:t>
+      </w:r>
+    </w:p>
+    <w:p>
+      <w:pPr>
+        <w:pStyle w:val="ListBullet"/>
+      </w:pPr>
+      <w:r>
+        <w:t>傷害保険の相談で支払可否を断定しない説明はどうしますか。</w:t>
+      </w:r>
+    </w:p>
+    <w:p>
+      <w:pPr>
+        <w:pStyle w:val="Heading2"/>
+      </w:pPr>
+      <w:r>
+        <w:t>対応場面</w:t>
+      </w:r>
+    </w:p>
+    <w:p>
+      <w:r>
+        <w:t>ブラジル人のお客様が「Quais documentos preciso para acionar o seguro de acidente?」と質問しており、事故原因、契約条件、必要書類、公的制度、民間保険、支払可否の違いを確認する場面。</w:t>
+      </w:r>
+    </w:p>
+    <w:p>
+      <w:pPr>
+        <w:pStyle w:val="Heading2"/>
+      </w:pPr>
+      <w:r>
+        <w:t>技術的回答</w:t>
+      </w:r>
+    </w:p>
+    <w:p>
+      <w:r>
+        <w:t>必要書類は、事故の種類、治療内容、契約条件、保険会社の請求手続きによって異なります。一般的には事故状況の説明、診断書または診療明細書、領収書、本人確認書類、保険会社指定の請求書類を確認します。不要な診断書費用を避けるため、先に保険会社の指定書類を確認することが重要です。</w:t>
+      </w:r>
+    </w:p>
+    <w:p>
+      <w:pPr>
+        <w:pStyle w:val="Heading2"/>
+      </w:pPr>
+      <w:r>
+        <w:t>ブラジル人顧客への回答</w:t>
+      </w:r>
+    </w:p>
+    <w:p>
+      <w:pPr>
+        <w:pStyle w:val="Heading3"/>
+      </w:pPr>
+      <w:r>
+        <w:t>ポルトガル語で伝える内容</w:t>
+      </w:r>
+    </w:p>
+    <w:p>
+      <w:r>
+        <w:t>Os documentos dependem do tipo de acidente e do contrato. Em geral, vamos confirmar relatório do acidente, documento médico, recibos, identificação e o formulário da seguradora antes de pedir documentos caros ao hospital.</w:t>
+      </w:r>
+    </w:p>
+    <w:p>
+      <w:pPr>
+        <w:pStyle w:val="Heading3"/>
+      </w:pPr>
+      <w:r>
+        <w:t>カタカナ読み</w:t>
+      </w:r>
+    </w:p>
+    <w:p>
+      <w:r>
+        <w:t>オス ドクメントス デペンデン ド チポ ジ アシデンチ イ ド コントラト。エン ジェラウ、ヴァモス コンフィルマール ヘラトリオ ド アシデンチ、ドクメント メジコ、ヘシボス、イデンチフィカサォン イ オ フォルムラリオ ダ セグラドーラ アンチス ジ ペジール ドクメントス カーロス アオ オスピタウ</w:t>
+      </w:r>
+    </w:p>
+    <w:p>
+      <w:r>
+        <w:t>日本語確認用: 上記のポルトガル語は、お客様に対して、契約確認、書類確認、保険会社の査定が必要であることを短く伝えるための説明です。</w:t>
+      </w:r>
+    </w:p>
+    <w:p>
+      <w:pPr>
+        <w:pStyle w:val="Heading2"/>
+      </w:pPr>
+      <w:r>
+        <w:t>安全な次のステップ</w:t>
+      </w:r>
+    </w:p>
+    <w:p>
+      <w:r>
+        <w:t>保険証券、約款、事故日、事故原因、治療記録、診断書または診療明細書、領収書、保険会社指定の請求書類を確認してから案内する。</w:t>
+      </w:r>
+    </w:p>
+    <w:p>
+      <w:pPr>
+        <w:pStyle w:val="Heading2"/>
+      </w:pPr>
+      <w:r>
+        <w:t>コンプライアンス上の注意</w:t>
+      </w:r>
+    </w:p>
+    <w:p>
+      <w:r>
+        <w:t>補償、保険金支払い、労災保険の扱い、医療判断、法的判断、支払金額を断定しない。最終判断は契約条件、提出書類、事故状況、関連制度および保険会社の査定による。</w:t>
+      </w:r>
+    </w:p>
+    <w:p>
+      <w:pPr>
+        <w:pStyle w:val="Heading2"/>
+      </w:pPr>
+      <w:r>
+        <w:t>関連用語</w:t>
+      </w:r>
+    </w:p>
+    <w:p>
+      <w:pPr>
+        <w:pStyle w:val="ListBullet"/>
+      </w:pPr>
+      <w:r>
         <w:t>ACC-0004 - 事故通知 - Aviso de acidente</w:t>
       </w:r>
     </w:p>
     <w:p>
       <w:pPr>
+        <w:pStyle w:val="ListBullet"/>
+      </w:pPr>
+      <w:r>
+        <w:t>ACC-0005 - 診断書 - Atestado médico</w:t>
+      </w:r>
+    </w:p>
+    <w:p>
+      <w:pPr>
+        <w:pStyle w:val="ListBullet"/>
+      </w:pPr>
+      <w:r>
+        <w:t>ACC-0006 - 診療明細書 - Detalhamento do atendimento médico</w:t>
+      </w:r>
+    </w:p>
+    <w:p>
+      <w:pPr>
         <w:pStyle w:val="Heading2"/>
       </w:pPr>
       <w:r>
@@ -334,7 +1547,7 @@
         <w:pStyle w:val="ListBullet"/>
       </w:pPr>
       <w:r>
-        <w:t>ACC-0001</w:t>
+        <w:t>ACC-0004</w:t>
       </w:r>
     </w:p>
     <w:p>
@@ -342,7 +1555,7 @@
         <w:pStyle w:val="ListBullet"/>
       </w:pPr>
       <w:r>
-        <w:t>ACC-0002</w:t>
+        <w:t>ACC-0005</w:t>
       </w:r>
     </w:p>
     <w:p>
@@ -350,7 +1563,7 @@
         <w:pStyle w:val="ListBullet"/>
       </w:pPr>
       <w:r>
-        <w:t>ACC-0003</w:t>
+        <w:t>ACC-0006</w:t>
       </w:r>
     </w:p>
     <w:p>
@@ -358,7 +1571,15 @@
         <w:pStyle w:val="ListBullet"/>
       </w:pPr>
       <w:r>
-        <w:t>ACC-0004</w:t>
+        <w:t>FAQ-ACC-0004</w:t>
+      </w:r>
+    </w:p>
+    <w:p>
+      <w:pPr>
+        <w:pStyle w:val="Heading2"/>
+      </w:pPr>
+      <w:r>
+        <w:t>参考資料</w:t>
       </w:r>
     </w:p>
     <w:p>
@@ -366,7 +1587,15 @@
         <w:pStyle w:val="ListBullet"/>
       </w:pPr>
       <w:r>
-        <w:t>FAQ-ACC-0001</w:t>
+        <w:t>Documento interno: `00_Project/multi_ai_pilot/ACC_FAQ_MULTI_AI_PILOT_REPORT_2026-06-29.md`</w:t>
+      </w:r>
+    </w:p>
+    <w:p>
+      <w:pPr>
+        <w:pStyle w:val="ListBullet"/>
+      </w:pPr>
+      <w:r>
+        <w:t>Fonte pública recomendada: 厚生労働省, 金融庁, 労働局, 保険会社の約款および請求書類</w:t>
       </w:r>
     </w:p>
     <w:p>
@@ -374,7 +1603,7 @@
         <w:pStyle w:val="Heading2"/>
       </w:pPr>
       <w:r>
-        <w:t>参考資料</w:t>
+        <w:t>タグ</w:t>
       </w:r>
     </w:p>
     <w:p>
@@ -382,7 +1611,7 @@
         <w:pStyle w:val="ListBullet"/>
       </w:pPr>
       <w:r>
-        <w:t>Documento interno: `00_Project/multi_ai_pilot/ACC_FAQ_MULTI_AI_PILOT_REPORT_2026-06-29.md`</w:t>
+        <w:t>faq</w:t>
       </w:r>
     </w:p>
     <w:p>
@@ -390,7 +1619,31 @@
         <w:pStyle w:val="ListBullet"/>
       </w:pPr>
       <w:r>
-        <w:t>Fonte pública recomendada: 厚生労働省, 金融庁, 労働局, 保険会社の約款および請求書類</w:t>
+        <w:t>acc</w:t>
+      </w:r>
+    </w:p>
+    <w:p>
+      <w:pPr>
+        <w:pStyle w:val="ListBullet"/>
+      </w:pPr>
+      <w:r>
+        <w:t>atendimento</w:t>
+      </w:r>
+    </w:p>
+    <w:p>
+      <w:pPr>
+        <w:pStyle w:val="ListBullet"/>
+      </w:pPr>
+      <w:r>
+        <w:t>japanese-broker</w:t>
+      </w:r>
+    </w:p>
+    <w:p>
+      <w:pPr>
+        <w:pStyle w:val="ListBullet"/>
+      </w:pPr>
+      <w:r>
+        <w:t>compliance</w:t>
       </w:r>
     </w:p>
     <w:p>
@@ -398,7 +1651,7 @@
         <w:pStyle w:val="Heading2"/>
       </w:pPr>
       <w:r>
-        <w:t>タグ</w:t>
+        <w:t>関連項目</w:t>
       </w:r>
     </w:p>
     <w:p>
@@ -406,7 +1659,7 @@
         <w:pStyle w:val="ListBullet"/>
       </w:pPr>
       <w:r>
-        <w:t>faq</w:t>
+        <w:t>`02_MasterDictionary/ACC/ACC-0001.md`</w:t>
       </w:r>
     </w:p>
     <w:p>
@@ -414,7 +1667,51 @@
         <w:pStyle w:val="ListBullet"/>
       </w:pPr>
       <w:r>
-        <w:t>acc</w:t>
+        <w:t>`00_Project/multi_ai_pilot/ACC_FAQ_MULTI_AI_PILOT_REPORT_2026-06-29.md`</w:t>
+      </w:r>
+    </w:p>
+    <w:p>
+      <w:pPr>
+        <w:pStyle w:val="Heading2"/>
+      </w:pPr>
+      <w:r>
+        <w:t>改訂履歴</w:t>
+      </w:r>
+    </w:p>
+    <w:p>
+      <w:r>
+        <w:t>| Data | Versão | Autor | Alteração |</w:t>
+      </w:r>
+    </w:p>
+    <w:p>
+      <w:r>
+        <w:t>| --- | --- | --- | --- |</w:t>
+      </w:r>
+    </w:p>
+    <w:p>
+      <w:r>
+        <w:t>| 2026-06-29 | 0.1 | JP-BR Insurance Knowledge Base | Criação inicial. |</w:t>
+      </w:r>
+    </w:p>
+    <w:p>
+      <w:r>
+        <w:t>---</w:t>
+      </w:r>
+    </w:p>
+    <w:p>
+      <w:pPr>
+        <w:pStyle w:val="Heading1"/>
+      </w:pPr>
+      <w:r>
+        <w:t>FAQ-ACC-0005 - 事故による入院はどのように説明しますか</w:t>
+      </w:r>
+    </w:p>
+    <w:p>
+      <w:pPr>
+        <w:pStyle w:val="Heading2"/>
+      </w:pPr>
+      <w:r>
+        <w:t>管理情報</w:t>
       </w:r>
     </w:p>
     <w:p>
@@ -422,7 +1719,7 @@
         <w:pStyle w:val="ListBullet"/>
       </w:pPr>
       <w:r>
-        <w:t>atendimento</w:t>
+        <w:t>Versão: 0.1</w:t>
       </w:r>
     </w:p>
     <w:p>
@@ -430,7 +1727,7 @@
         <w:pStyle w:val="ListBullet"/>
       </w:pPr>
       <w:r>
-        <w:t>japanese-broker</w:t>
+        <w:t>Data: 2026-06-29</w:t>
       </w:r>
     </w:p>
     <w:p>
@@ -438,7 +1735,15 @@
         <w:pStyle w:val="ListBullet"/>
       </w:pPr>
       <w:r>
-        <w:t>compliance</w:t>
+        <w:t>Autor: JP-BR Insurance Knowledge Base</w:t>
+      </w:r>
+    </w:p>
+    <w:p>
+      <w:pPr>
+        <w:pStyle w:val="ListBullet"/>
+      </w:pPr>
+      <w:r>
+        <w:t>Histórico: Criação inicial a partir do piloto multi-IA ACC, com remoção de romaji e revisão de compliance.</w:t>
       </w:r>
     </w:p>
     <w:p>
@@ -446,7 +1751,46 @@
         <w:pStyle w:val="Heading2"/>
       </w:pPr>
       <w:r>
-        <w:t>関連項目</w:t>
+        <w:t>コード</w:t>
+      </w:r>
+    </w:p>
+    <w:p>
+      <w:r>
+        <w:t>FAQ-ACC-0005</w:t>
+      </w:r>
+    </w:p>
+    <w:p>
+      <w:pPr>
+        <w:pStyle w:val="Heading2"/>
+      </w:pPr>
+      <w:r>
+        <w:t>カテゴリー</w:t>
+      </w:r>
+    </w:p>
+    <w:p>
+      <w:r>
+        <w:t>ACC</w:t>
+      </w:r>
+    </w:p>
+    <w:p>
+      <w:pPr>
+        <w:pStyle w:val="Heading2"/>
+      </w:pPr>
+      <w:r>
+        <w:t>質問</w:t>
+      </w:r>
+    </w:p>
+    <w:p>
+      <w:r>
+        <w:t>事故による入院はどのように説明しますか</w:t>
+      </w:r>
+    </w:p>
+    <w:p>
+      <w:pPr>
+        <w:pStyle w:val="Heading2"/>
+      </w:pPr>
+      <w:r>
+        <w:t>日本語での自然な検索</w:t>
       </w:r>
     </w:p>
     <w:p>
@@ -454,7 +1798,7 @@
         <w:pStyle w:val="ListBullet"/>
       </w:pPr>
       <w:r>
-        <w:t>`02_MasterDictionary/ACC/ACC-0001.md`</w:t>
+        <w:t>事故による入院はどのように説明しますか</w:t>
       </w:r>
     </w:p>
     <w:p>
@@ -462,7 +1806,15 @@
         <w:pStyle w:val="ListBullet"/>
       </w:pPr>
       <w:r>
-        <w:t>`00_Project/multi_ai_pilot/ACC_FAQ_MULTI_AI_PILOT_REPORT_2026-06-29.md`</w:t>
+        <w:t>ブラジル人のお客様に事故保険をどう説明しますか。</w:t>
+      </w:r>
+    </w:p>
+    <w:p>
+      <w:pPr>
+        <w:pStyle w:val="ListBullet"/>
+      </w:pPr>
+      <w:r>
+        <w:t>傷害保険の相談で支払可否を断定しない説明はどうしますか。</w:t>
       </w:r>
     </w:p>
     <w:p>
@@ -470,35 +1822,12 @@
         <w:pStyle w:val="Heading2"/>
       </w:pPr>
       <w:r>
-        <w:t>改訂履歴</w:t>
-      </w:r>
-    </w:p>
-    <w:p>
-      <w:r>
-        <w:t>| Data | Versão | Autor | Alteração |</w:t>
-      </w:r>
-    </w:p>
-    <w:p>
-      <w:r>
-        <w:t>| --- | --- | --- | --- |</w:t>
-      </w:r>
-    </w:p>
-    <w:p>
-      <w:r>
-        <w:t>| 2026-06-29 | 0.1 | JP-BR Insurance Knowledge Base | Criação inicial. |</w:t>
-      </w:r>
-    </w:p>
-    <w:p>
-      <w:r>
-        <w:t>---</w:t>
-      </w:r>
-    </w:p>
-    <w:p>
-      <w:pPr>
-        <w:pStyle w:val="Heading1"/>
-      </w:pPr>
-      <w:r>
-        <w:t>FAQ-ACC-0002 - 傷害保険と医療保険の違いをどう説明しますか</w:t>
+        <w:t>対応場面</w:t>
+      </w:r>
+    </w:p>
+    <w:p>
+      <w:r>
+        <w:t>ブラジル人のお客様が「Fui internado por causa de um acidente. O seguro pode ajudar?」と質問しており、事故原因、契約条件、必要書類、公的制度、民間保険、支払可否の違いを確認する場面。</w:t>
       </w:r>
     </w:p>
     <w:p>
@@ -506,39 +1835,12 @@
         <w:pStyle w:val="Heading2"/>
       </w:pPr>
       <w:r>
-        <w:t>管理情報</w:t>
-      </w:r>
-    </w:p>
-    <w:p>
-      <w:pPr>
-        <w:pStyle w:val="ListBullet"/>
-      </w:pPr>
-      <w:r>
-        <w:t>Versão: 0.1</w:t>
-      </w:r>
-    </w:p>
-    <w:p>
-      <w:pPr>
-        <w:pStyle w:val="ListBullet"/>
-      </w:pPr>
-      <w:r>
-        <w:t>Data: 2026-06-29</w:t>
-      </w:r>
-    </w:p>
-    <w:p>
-      <w:pPr>
-        <w:pStyle w:val="ListBullet"/>
-      </w:pPr>
-      <w:r>
-        <w:t>Autor: JP-BR Insurance Knowledge Base</w:t>
-      </w:r>
-    </w:p>
-    <w:p>
-      <w:pPr>
-        <w:pStyle w:val="ListBullet"/>
-      </w:pPr>
-      <w:r>
-        <w:t>Histórico: Criação inicial a partir do piloto multi-IA ACC, com remoção de romaji e revisão de compliance.</w:t>
+        <w:t>技術的回答</w:t>
+      </w:r>
+    </w:p>
+    <w:p>
+      <w:r>
+        <w:t>事故を原因とする入院は、契約上の入院保険金の確認対象となりえます。ただし、事故と入院の因果関係、対象となる病院、支払日数、免責日数、必要書類、契約上の限度を確認する必要があります。免責日数は、事故後の一定日数が支払対象外となる仕組みであり、加入直後の待機期間とは区別して説明します。</w:t>
       </w:r>
     </w:p>
     <w:p>
@@ -546,103 +1848,6 @@
         <w:pStyle w:val="Heading2"/>
       </w:pPr>
       <w:r>
-        <w:t>コード</w:t>
-      </w:r>
-    </w:p>
-    <w:p>
-      <w:r>
-        <w:t>FAQ-ACC-0002</w:t>
-      </w:r>
-    </w:p>
-    <w:p>
-      <w:pPr>
-        <w:pStyle w:val="Heading2"/>
-      </w:pPr>
-      <w:r>
-        <w:t>カテゴリー</w:t>
-      </w:r>
-    </w:p>
-    <w:p>
-      <w:r>
-        <w:t>ACC</w:t>
-      </w:r>
-    </w:p>
-    <w:p>
-      <w:pPr>
-        <w:pStyle w:val="Heading2"/>
-      </w:pPr>
-      <w:r>
-        <w:t>質問</w:t>
-      </w:r>
-    </w:p>
-    <w:p>
-      <w:r>
-        <w:t>傷害保険と医療保険の違いをどう説明しますか</w:t>
-      </w:r>
-    </w:p>
-    <w:p>
-      <w:pPr>
-        <w:pStyle w:val="Heading2"/>
-      </w:pPr>
-      <w:r>
-        <w:t>日本語での自然な検索</w:t>
-      </w:r>
-    </w:p>
-    <w:p>
-      <w:pPr>
-        <w:pStyle w:val="ListBullet"/>
-      </w:pPr>
-      <w:r>
-        <w:t>傷害保険と医療保険の違いをどう説明しますか</w:t>
-      </w:r>
-    </w:p>
-    <w:p>
-      <w:pPr>
-        <w:pStyle w:val="ListBullet"/>
-      </w:pPr>
-      <w:r>
-        <w:t>ブラジル人のお客様に事故保険をどう説明しますか。</w:t>
-      </w:r>
-    </w:p>
-    <w:p>
-      <w:pPr>
-        <w:pStyle w:val="ListBullet"/>
-      </w:pPr>
-      <w:r>
-        <w:t>傷害保険の相談で支払可否を断定しない説明はどうしますか。</w:t>
-      </w:r>
-    </w:p>
-    <w:p>
-      <w:pPr>
-        <w:pStyle w:val="Heading2"/>
-      </w:pPr>
-      <w:r>
-        <w:t>対応場面</w:t>
-      </w:r>
-    </w:p>
-    <w:p>
-      <w:r>
-        <w:t>ブラジル人のお客様が「Qual é a diferença entre seguro de acidente e seguro médico?」と質問しており、事故原因、契約条件、必要書類、公的制度、民間保険、支払可否の違いを確認する場面。</w:t>
-      </w:r>
-    </w:p>
-    <w:p>
-      <w:pPr>
-        <w:pStyle w:val="Heading2"/>
-      </w:pPr>
-      <w:r>
-        <w:t>技術的回答</w:t>
-      </w:r>
-    </w:p>
-    <w:p>
-      <w:r>
-        <w:t>傷害保険は、急激・偶然・外来の事故によるけがを中心に確認する保険です。医療保険は、病気や治療、入院、手術などを契約条件に沿って確認する保険です。事故か病気か、どの契約か、どの給付条件かを分けて案内する必要があります。</w:t>
-      </w:r>
-    </w:p>
-    <w:p>
-      <w:pPr>
-        <w:pStyle w:val="Heading2"/>
-      </w:pPr>
-      <w:r>
         <w:t>ブラジル人顧客への回答</w:t>
       </w:r>
     </w:p>
@@ -651,12 +1856,12 @@
         <w:pStyle w:val="Heading3"/>
       </w:pPr>
       <w:r>
-        <w:t>PT-Br</w:t>
-      </w:r>
-    </w:p>
-    <w:p>
-      <w:r>
-        <w:t>O seguro de acidente é voltado para ferimentos causados por acidente. O seguro médico trata de doença, internação ou cirurgia conforme o contrato. Vamos separar a causa e verificar qual seguro se aplica.</w:t>
+        <w:t>ポルトガル語で伝える内容</w:t>
+      </w:r>
+    </w:p>
+    <w:p>
+      <w:r>
+        <w:t>Se a internação foi causada por acidente, o seguro pode ser analisado conforme o contrato. Vamos verificar o motivo da internação, os dias, a franquia temporal, os documentos e a decisão da seguradora.</w:t>
       </w:r>
     </w:p>
     <w:p>
@@ -664,1287 +1869,17 @@
         <w:pStyle w:val="Heading3"/>
       </w:pPr>
       <w:r>
-        <w:t>JP（ふりがな）</w:t>
-      </w:r>
-    </w:p>
-    <w:p>
-      <w:r>
-        <w:t>上記のポルトガル語は、お客様に対して、契約確認、書類確認、保険会社の査定が必要であることを短く伝えるための説明です。</w:t>
-      </w:r>
-    </w:p>
-    <w:p>
-      <w:r>
-        <w:t>ふりがな: けいやくかくにん、しょるいかくにん、ほけんがいしゃのさていがひつようであることを、みじかくつたえます。</w:t>
-      </w:r>
-    </w:p>
-    <w:p>
-      <w:pPr>
-        <w:pStyle w:val="Heading3"/>
-      </w:pPr>
-      <w:r>
-        <w:t>Leitura de apoio para o corretor</w:t>
-      </w:r>
-    </w:p>
-    <w:p>
-      <w:r>
-        <w:t>オ セグーロ ジ アシデンチ エ ヴォウタード パラ フェリメントス カウザードス ポル アシデンチ。オ セグーロ メジコ トラタ ジ ドエンサ、インテルナサォン オウ シルルジア コンフォルミ オ コントラト。ヴァモス セパラール ア カウザ イ ヴェリフィカール クアウ セグーロ セ アプリカ</w:t>
-      </w:r>
-    </w:p>
-    <w:p>
-      <w:pPr>
-        <w:pStyle w:val="Heading2"/>
-      </w:pPr>
-      <w:r>
-        <w:t>安全な次のステップ</w:t>
-      </w:r>
-    </w:p>
-    <w:p>
-      <w:r>
-        <w:t>保険証券、約款、事故日、事故原因、治療記録、診断書または診療明細書、領収書、保険会社指定の請求書類を確認してから案内する。</w:t>
-      </w:r>
-    </w:p>
-    <w:p>
-      <w:pPr>
-        <w:pStyle w:val="Heading2"/>
-      </w:pPr>
-      <w:r>
-        <w:t>コンプライアンス上の注意</w:t>
-      </w:r>
-    </w:p>
-    <w:p>
-      <w:r>
-        <w:t>補償、保険金支払い、労災保険の扱い、医療判断、法的判断、支払金額を断定しない。最終判断は契約条件、提出書類、事故状況、関連制度および保険会社の査定による。</w:t>
-      </w:r>
-    </w:p>
-    <w:p>
-      <w:pPr>
-        <w:pStyle w:val="Heading2"/>
-      </w:pPr>
-      <w:r>
-        <w:t>関連用語</w:t>
-      </w:r>
-    </w:p>
-    <w:p>
-      <w:pPr>
-        <w:pStyle w:val="ListBullet"/>
-      </w:pPr>
-      <w:r>
-        <w:t>ACC-0001 - 傷害保険 - Seguro de acidentes pessoais</w:t>
-      </w:r>
-    </w:p>
-    <w:p>
-      <w:pPr>
-        <w:pStyle w:val="ListBullet"/>
-      </w:pPr>
-      <w:r>
-        <w:t>MED-0001 - 医療保険 - Seguro médico</w:t>
-      </w:r>
-    </w:p>
-    <w:p>
-      <w:pPr>
-        <w:pStyle w:val="Heading2"/>
-      </w:pPr>
-      <w:r>
-        <w:t>相互参照</w:t>
-      </w:r>
-    </w:p>
-    <w:p>
-      <w:pPr>
-        <w:pStyle w:val="ListBullet"/>
-      </w:pPr>
-      <w:r>
-        <w:t>ACC-0001</w:t>
-      </w:r>
-    </w:p>
-    <w:p>
-      <w:pPr>
-        <w:pStyle w:val="ListBullet"/>
-      </w:pPr>
-      <w:r>
-        <w:t>MED-0001</w:t>
-      </w:r>
-    </w:p>
-    <w:p>
-      <w:pPr>
-        <w:pStyle w:val="ListBullet"/>
-      </w:pPr>
-      <w:r>
-        <w:t>FAQ-ACC-0002</w:t>
-      </w:r>
-    </w:p>
-    <w:p>
-      <w:pPr>
-        <w:pStyle w:val="Heading2"/>
-      </w:pPr>
-      <w:r>
-        <w:t>参考資料</w:t>
-      </w:r>
-    </w:p>
-    <w:p>
-      <w:pPr>
-        <w:pStyle w:val="ListBullet"/>
-      </w:pPr>
-      <w:r>
-        <w:t>Documento interno: `00_Project/multi_ai_pilot/ACC_FAQ_MULTI_AI_PILOT_REPORT_2026-06-29.md`</w:t>
-      </w:r>
-    </w:p>
-    <w:p>
-      <w:pPr>
-        <w:pStyle w:val="ListBullet"/>
-      </w:pPr>
-      <w:r>
-        <w:t>Fonte pública recomendada: 厚生労働省, 金融庁, 労働局, 保険会社の約款および請求書類</w:t>
-      </w:r>
-    </w:p>
-    <w:p>
-      <w:pPr>
-        <w:pStyle w:val="Heading2"/>
-      </w:pPr>
-      <w:r>
-        <w:t>タグ</w:t>
-      </w:r>
-    </w:p>
-    <w:p>
-      <w:pPr>
-        <w:pStyle w:val="ListBullet"/>
-      </w:pPr>
-      <w:r>
-        <w:t>faq</w:t>
-      </w:r>
-    </w:p>
-    <w:p>
-      <w:pPr>
-        <w:pStyle w:val="ListBullet"/>
-      </w:pPr>
-      <w:r>
-        <w:t>acc</w:t>
-      </w:r>
-    </w:p>
-    <w:p>
-      <w:pPr>
-        <w:pStyle w:val="ListBullet"/>
-      </w:pPr>
-      <w:r>
-        <w:t>atendimento</w:t>
-      </w:r>
-    </w:p>
-    <w:p>
-      <w:pPr>
-        <w:pStyle w:val="ListBullet"/>
-      </w:pPr>
-      <w:r>
-        <w:t>japanese-broker</w:t>
-      </w:r>
-    </w:p>
-    <w:p>
-      <w:pPr>
-        <w:pStyle w:val="ListBullet"/>
-      </w:pPr>
-      <w:r>
-        <w:t>compliance</w:t>
-      </w:r>
-    </w:p>
-    <w:p>
-      <w:pPr>
-        <w:pStyle w:val="Heading2"/>
-      </w:pPr>
-      <w:r>
-        <w:t>関連項目</w:t>
-      </w:r>
-    </w:p>
-    <w:p>
-      <w:pPr>
-        <w:pStyle w:val="ListBullet"/>
-      </w:pPr>
-      <w:r>
-        <w:t>`02_MasterDictionary/ACC/ACC-0001.md`</w:t>
-      </w:r>
-    </w:p>
-    <w:p>
-      <w:pPr>
-        <w:pStyle w:val="ListBullet"/>
-      </w:pPr>
-      <w:r>
-        <w:t>`00_Project/multi_ai_pilot/ACC_FAQ_MULTI_AI_PILOT_REPORT_2026-06-29.md`</w:t>
-      </w:r>
-    </w:p>
-    <w:p>
-      <w:pPr>
-        <w:pStyle w:val="Heading2"/>
-      </w:pPr>
-      <w:r>
-        <w:t>改訂履歴</w:t>
-      </w:r>
-    </w:p>
-    <w:p>
-      <w:r>
-        <w:t>| Data | Versão | Autor | Alteração |</w:t>
-      </w:r>
-    </w:p>
-    <w:p>
-      <w:r>
-        <w:t>| --- | --- | --- | --- |</w:t>
-      </w:r>
-    </w:p>
-    <w:p>
-      <w:r>
-        <w:t>| 2026-06-29 | 0.1 | JP-BR Insurance Knowledge Base | Criação inicial. |</w:t>
-      </w:r>
-    </w:p>
-    <w:p>
-      <w:r>
-        <w:t>---</w:t>
-      </w:r>
-    </w:p>
-    <w:p>
-      <w:pPr>
-        <w:pStyle w:val="Heading1"/>
-      </w:pPr>
-      <w:r>
-        <w:t>FAQ-ACC-0003 - 事故による骨折では何を確認しますか</w:t>
-      </w:r>
-    </w:p>
-    <w:p>
-      <w:pPr>
-        <w:pStyle w:val="Heading2"/>
-      </w:pPr>
-      <w:r>
-        <w:t>管理情報</w:t>
-      </w:r>
-    </w:p>
-    <w:p>
-      <w:pPr>
-        <w:pStyle w:val="ListBullet"/>
-      </w:pPr>
-      <w:r>
-        <w:t>Versão: 0.1</w:t>
-      </w:r>
-    </w:p>
-    <w:p>
-      <w:pPr>
-        <w:pStyle w:val="ListBullet"/>
-      </w:pPr>
-      <w:r>
-        <w:t>Data: 2026-06-29</w:t>
-      </w:r>
-    </w:p>
-    <w:p>
-      <w:pPr>
-        <w:pStyle w:val="ListBullet"/>
-      </w:pPr>
-      <w:r>
-        <w:t>Autor: JP-BR Insurance Knowledge Base</w:t>
-      </w:r>
-    </w:p>
-    <w:p>
-      <w:pPr>
-        <w:pStyle w:val="ListBullet"/>
-      </w:pPr>
-      <w:r>
-        <w:t>Histórico: Criação inicial a partir do piloto multi-IA ACC, com remoção de romaji e revisão de compliance.</w:t>
-      </w:r>
-    </w:p>
-    <w:p>
-      <w:pPr>
-        <w:pStyle w:val="Heading2"/>
-      </w:pPr>
-      <w:r>
-        <w:t>コード</w:t>
-      </w:r>
-    </w:p>
-    <w:p>
-      <w:r>
-        <w:t>FAQ-ACC-0003</w:t>
-      </w:r>
-    </w:p>
-    <w:p>
-      <w:pPr>
-        <w:pStyle w:val="Heading2"/>
-      </w:pPr>
-      <w:r>
-        <w:t>カテゴリー</w:t>
-      </w:r>
-    </w:p>
-    <w:p>
-      <w:r>
-        <w:t>ACC</w:t>
-      </w:r>
-    </w:p>
-    <w:p>
-      <w:pPr>
-        <w:pStyle w:val="Heading2"/>
-      </w:pPr>
-      <w:r>
-        <w:t>質問</w:t>
-      </w:r>
-    </w:p>
-    <w:p>
-      <w:r>
-        <w:t>事故による骨折では何を確認しますか</w:t>
-      </w:r>
-    </w:p>
-    <w:p>
-      <w:pPr>
-        <w:pStyle w:val="Heading2"/>
-      </w:pPr>
-      <w:r>
-        <w:t>日本語での自然な検索</w:t>
-      </w:r>
-    </w:p>
-    <w:p>
-      <w:pPr>
-        <w:pStyle w:val="ListBullet"/>
-      </w:pPr>
-      <w:r>
-        <w:t>事故による骨折では何を確認しますか</w:t>
-      </w:r>
-    </w:p>
-    <w:p>
-      <w:pPr>
-        <w:pStyle w:val="ListBullet"/>
-      </w:pPr>
-      <w:r>
-        <w:t>ブラジル人のお客様に事故保険をどう説明しますか。</w:t>
-      </w:r>
-    </w:p>
-    <w:p>
-      <w:pPr>
-        <w:pStyle w:val="ListBullet"/>
-      </w:pPr>
-      <w:r>
-        <w:t>傷害保険の相談で支払可否を断定しない説明はどうしますか。</w:t>
-      </w:r>
-    </w:p>
-    <w:p>
-      <w:pPr>
-        <w:pStyle w:val="Heading2"/>
-      </w:pPr>
-      <w:r>
-        <w:t>対応場面</w:t>
-      </w:r>
-    </w:p>
-    <w:p>
-      <w:r>
-        <w:t>ブラジル人のお客様が「Quebrei um osso em um acidente. O que preciso confirmar?」と質問しており、事故原因、契約条件、必要書類、公的制度、民間保険、支払可否の違いを確認する場面。</w:t>
-      </w:r>
-    </w:p>
-    <w:p>
-      <w:pPr>
-        <w:pStyle w:val="Heading2"/>
-      </w:pPr>
-      <w:r>
-        <w:t>技術的回答</w:t>
-      </w:r>
-    </w:p>
-    <w:p>
-      <w:r>
-        <w:t>事故による骨折は傷害保険の確認対象となりえますが、事故性、診断内容、治療内容、入院・通院・手術の有無、必要書類、契約条件を確認する必要があります。既往症や体質が影響する場合は、保険会社の査定で取り扱いが変わる可能性があります。</w:t>
-      </w:r>
-    </w:p>
-    <w:p>
-      <w:pPr>
-        <w:pStyle w:val="Heading2"/>
-      </w:pPr>
-      <w:r>
-        <w:t>ブラジル人顧客への回答</w:t>
-      </w:r>
-    </w:p>
-    <w:p>
-      <w:pPr>
-        <w:pStyle w:val="Heading3"/>
-      </w:pPr>
-      <w:r>
-        <w:t>PT-Br</w:t>
-      </w:r>
-    </w:p>
-    <w:p>
-      <w:r>
-        <w:t>Fratura causada por acidente pode ser analisada pelo seguro de acidentes, mas precisamos confirmar o contrato, o diagnóstico, os documentos e se houve internação, cirurgia ou tratamento ambulatorial. A seguradora fará a análise final.</w:t>
-      </w:r>
-    </w:p>
-    <w:p>
-      <w:pPr>
-        <w:pStyle w:val="Heading3"/>
-      </w:pPr>
-      <w:r>
-        <w:t>JP（ふりがな）</w:t>
-      </w:r>
-    </w:p>
-    <w:p>
-      <w:r>
-        <w:t>上記のポルトガル語は、お客様に対して、契約確認、書類確認、保険会社の査定が必要であることを短く伝えるための説明です。</w:t>
-      </w:r>
-    </w:p>
-    <w:p>
-      <w:r>
-        <w:t>ふりがな: けいやくかくにん、しょるいかくにん、ほけんがいしゃのさていがひつようであることを、みじかくつたえます。</w:t>
-      </w:r>
-    </w:p>
-    <w:p>
-      <w:pPr>
-        <w:pStyle w:val="Heading3"/>
-      </w:pPr>
-      <w:r>
-        <w:t>Leitura de apoio para o corretor</w:t>
-      </w:r>
-    </w:p>
-    <w:p>
-      <w:r>
-        <w:t>フラトゥーラ カウザーダ ポル アシデンチ ポジ セール アナリザーダ ペロ セグーロ ジ アシデンチス、マス プレシザモス コンフィルマール オ コントラト、オ ジアグノスチコ、オス ドクメントス イ セ オウヴィ インテルナサォン、シルルジア オウ トラタメント アンブラトリアウ。ア セグラドーラ ファラ ア アナリジ フィナウ</w:t>
-      </w:r>
-    </w:p>
-    <w:p>
-      <w:pPr>
-        <w:pStyle w:val="Heading2"/>
-      </w:pPr>
-      <w:r>
-        <w:t>安全な次のステップ</w:t>
-      </w:r>
-    </w:p>
-    <w:p>
-      <w:r>
-        <w:t>保険証券、約款、事故日、事故原因、治療記録、診断書または診療明細書、領収書、保険会社指定の請求書類を確認してから案内する。</w:t>
-      </w:r>
-    </w:p>
-    <w:p>
-      <w:pPr>
-        <w:pStyle w:val="Heading2"/>
-      </w:pPr>
-      <w:r>
-        <w:t>コンプライアンス上の注意</w:t>
-      </w:r>
-    </w:p>
-    <w:p>
-      <w:r>
-        <w:t>補償、保険金支払い、労災保険の扱い、医療判断、法的判断、支払金額を断定しない。最終判断は契約条件、提出書類、事故状況、関連制度および保険会社の査定による。</w:t>
-      </w:r>
-    </w:p>
-    <w:p>
-      <w:pPr>
-        <w:pStyle w:val="Heading2"/>
-      </w:pPr>
-      <w:r>
-        <w:t>関連用語</w:t>
-      </w:r>
-    </w:p>
-    <w:p>
-      <w:pPr>
-        <w:pStyle w:val="ListBullet"/>
-      </w:pPr>
-      <w:r>
-        <w:t>ACC-0001 - 傷害保険 - Seguro de acidentes pessoais</w:t>
-      </w:r>
-    </w:p>
-    <w:p>
-      <w:pPr>
-        <w:pStyle w:val="ListBullet"/>
-      </w:pPr>
-      <w:r>
-        <w:t>ACC-0005 - 診断書 - Atestado médico</w:t>
-      </w:r>
-    </w:p>
-    <w:p>
-      <w:pPr>
-        <w:pStyle w:val="ListBullet"/>
-      </w:pPr>
-      <w:r>
-        <w:t>ACC-0006 - 診療明細書 - Detalhamento do atendimento médico</w:t>
-      </w:r>
-    </w:p>
-    <w:p>
-      <w:pPr>
-        <w:pStyle w:val="ListBullet"/>
-      </w:pPr>
-      <w:r>
-        <w:t>ACC-0008 - 手術保険金 - Benefício por cirurgia causada por acidente</w:t>
-      </w:r>
-    </w:p>
-    <w:p>
-      <w:pPr>
-        <w:pStyle w:val="Heading2"/>
-      </w:pPr>
-      <w:r>
-        <w:t>相互参照</w:t>
-      </w:r>
-    </w:p>
-    <w:p>
-      <w:pPr>
-        <w:pStyle w:val="ListBullet"/>
-      </w:pPr>
-      <w:r>
-        <w:t>ACC-0001</w:t>
-      </w:r>
-    </w:p>
-    <w:p>
-      <w:pPr>
-        <w:pStyle w:val="ListBullet"/>
-      </w:pPr>
-      <w:r>
-        <w:t>ACC-0005</w:t>
-      </w:r>
-    </w:p>
-    <w:p>
-      <w:pPr>
-        <w:pStyle w:val="ListBullet"/>
-      </w:pPr>
-      <w:r>
-        <w:t>ACC-0006</w:t>
-      </w:r>
-    </w:p>
-    <w:p>
-      <w:pPr>
-        <w:pStyle w:val="ListBullet"/>
-      </w:pPr>
-      <w:r>
-        <w:t>ACC-0008</w:t>
-      </w:r>
-    </w:p>
-    <w:p>
-      <w:pPr>
-        <w:pStyle w:val="ListBullet"/>
-      </w:pPr>
-      <w:r>
-        <w:t>FAQ-ACC-0003</w:t>
-      </w:r>
-    </w:p>
-    <w:p>
-      <w:pPr>
-        <w:pStyle w:val="Heading2"/>
-      </w:pPr>
-      <w:r>
-        <w:t>参考資料</w:t>
-      </w:r>
-    </w:p>
-    <w:p>
-      <w:pPr>
-        <w:pStyle w:val="ListBullet"/>
-      </w:pPr>
-      <w:r>
-        <w:t>Documento interno: `00_Project/multi_ai_pilot/ACC_FAQ_MULTI_AI_PILOT_REPORT_2026-06-29.md`</w:t>
-      </w:r>
-    </w:p>
-    <w:p>
-      <w:pPr>
-        <w:pStyle w:val="ListBullet"/>
-      </w:pPr>
-      <w:r>
-        <w:t>Fonte pública recomendada: 厚生労働省, 金融庁, 労働局, 保険会社の約款および請求書類</w:t>
-      </w:r>
-    </w:p>
-    <w:p>
-      <w:pPr>
-        <w:pStyle w:val="Heading2"/>
-      </w:pPr>
-      <w:r>
-        <w:t>タグ</w:t>
-      </w:r>
-    </w:p>
-    <w:p>
-      <w:pPr>
-        <w:pStyle w:val="ListBullet"/>
-      </w:pPr>
-      <w:r>
-        <w:t>faq</w:t>
-      </w:r>
-    </w:p>
-    <w:p>
-      <w:pPr>
-        <w:pStyle w:val="ListBullet"/>
-      </w:pPr>
-      <w:r>
-        <w:t>acc</w:t>
-      </w:r>
-    </w:p>
-    <w:p>
-      <w:pPr>
-        <w:pStyle w:val="ListBullet"/>
-      </w:pPr>
-      <w:r>
-        <w:t>atendimento</w:t>
-      </w:r>
-    </w:p>
-    <w:p>
-      <w:pPr>
-        <w:pStyle w:val="ListBullet"/>
-      </w:pPr>
-      <w:r>
-        <w:t>japanese-broker</w:t>
-      </w:r>
-    </w:p>
-    <w:p>
-      <w:pPr>
-        <w:pStyle w:val="ListBullet"/>
-      </w:pPr>
-      <w:r>
-        <w:t>compliance</w:t>
-      </w:r>
-    </w:p>
-    <w:p>
-      <w:pPr>
-        <w:pStyle w:val="Heading2"/>
-      </w:pPr>
-      <w:r>
-        <w:t>関連項目</w:t>
-      </w:r>
-    </w:p>
-    <w:p>
-      <w:pPr>
-        <w:pStyle w:val="ListBullet"/>
-      </w:pPr>
-      <w:r>
-        <w:t>`02_MasterDictionary/ACC/ACC-0001.md`</w:t>
-      </w:r>
-    </w:p>
-    <w:p>
-      <w:pPr>
-        <w:pStyle w:val="ListBullet"/>
-      </w:pPr>
-      <w:r>
-        <w:t>`00_Project/multi_ai_pilot/ACC_FAQ_MULTI_AI_PILOT_REPORT_2026-06-29.md`</w:t>
-      </w:r>
-    </w:p>
-    <w:p>
-      <w:pPr>
-        <w:pStyle w:val="Heading2"/>
-      </w:pPr>
-      <w:r>
-        <w:t>改訂履歴</w:t>
-      </w:r>
-    </w:p>
-    <w:p>
-      <w:r>
-        <w:t>| Data | Versão | Autor | Alteração |</w:t>
-      </w:r>
-    </w:p>
-    <w:p>
-      <w:r>
-        <w:t>| --- | --- | --- | --- |</w:t>
-      </w:r>
-    </w:p>
-    <w:p>
-      <w:r>
-        <w:t>| 2026-06-29 | 0.1 | JP-BR Insurance Knowledge Base | Criação inicial. |</w:t>
-      </w:r>
-    </w:p>
-    <w:p>
-      <w:r>
-        <w:t>---</w:t>
-      </w:r>
-    </w:p>
-    <w:p>
-      <w:pPr>
-        <w:pStyle w:val="Heading1"/>
-      </w:pPr>
-      <w:r>
-        <w:t>FAQ-ACC-0004 - 事故保険の請求に必要な書類は何ですか</w:t>
-      </w:r>
-    </w:p>
-    <w:p>
-      <w:pPr>
-        <w:pStyle w:val="Heading2"/>
-      </w:pPr>
-      <w:r>
-        <w:t>管理情報</w:t>
-      </w:r>
-    </w:p>
-    <w:p>
-      <w:pPr>
-        <w:pStyle w:val="ListBullet"/>
-      </w:pPr>
-      <w:r>
-        <w:t>Versão: 0.1</w:t>
-      </w:r>
-    </w:p>
-    <w:p>
-      <w:pPr>
-        <w:pStyle w:val="ListBullet"/>
-      </w:pPr>
-      <w:r>
-        <w:t>Data: 2026-06-29</w:t>
-      </w:r>
-    </w:p>
-    <w:p>
-      <w:pPr>
-        <w:pStyle w:val="ListBullet"/>
-      </w:pPr>
-      <w:r>
-        <w:t>Autor: JP-BR Insurance Knowledge Base</w:t>
-      </w:r>
-    </w:p>
-    <w:p>
-      <w:pPr>
-        <w:pStyle w:val="ListBullet"/>
-      </w:pPr>
-      <w:r>
-        <w:t>Histórico: Criação inicial a partir do piloto multi-IA ACC, com remoção de romaji e revisão de compliance.</w:t>
-      </w:r>
-    </w:p>
-    <w:p>
-      <w:pPr>
-        <w:pStyle w:val="Heading2"/>
-      </w:pPr>
-      <w:r>
-        <w:t>コード</w:t>
-      </w:r>
-    </w:p>
-    <w:p>
-      <w:r>
-        <w:t>FAQ-ACC-0004</w:t>
-      </w:r>
-    </w:p>
-    <w:p>
-      <w:pPr>
-        <w:pStyle w:val="Heading2"/>
-      </w:pPr>
-      <w:r>
-        <w:t>カテゴリー</w:t>
-      </w:r>
-    </w:p>
-    <w:p>
-      <w:r>
-        <w:t>ACC</w:t>
-      </w:r>
-    </w:p>
-    <w:p>
-      <w:pPr>
-        <w:pStyle w:val="Heading2"/>
-      </w:pPr>
-      <w:r>
-        <w:t>質問</w:t>
-      </w:r>
-    </w:p>
-    <w:p>
-      <w:r>
-        <w:t>事故保険の請求に必要な書類は何ですか</w:t>
-      </w:r>
-    </w:p>
-    <w:p>
-      <w:pPr>
-        <w:pStyle w:val="Heading2"/>
-      </w:pPr>
-      <w:r>
-        <w:t>日本語での自然な検索</w:t>
-      </w:r>
-    </w:p>
-    <w:p>
-      <w:pPr>
-        <w:pStyle w:val="ListBullet"/>
-      </w:pPr>
-      <w:r>
-        <w:t>事故保険の請求に必要な書類は何ですか</w:t>
-      </w:r>
-    </w:p>
-    <w:p>
-      <w:pPr>
-        <w:pStyle w:val="ListBullet"/>
-      </w:pPr>
-      <w:r>
-        <w:t>ブラジル人のお客様に事故保険をどう説明しますか。</w:t>
-      </w:r>
-    </w:p>
-    <w:p>
-      <w:pPr>
-        <w:pStyle w:val="ListBullet"/>
-      </w:pPr>
-      <w:r>
-        <w:t>傷害保険の相談で支払可否を断定しない説明はどうしますか。</w:t>
-      </w:r>
-    </w:p>
-    <w:p>
-      <w:pPr>
-        <w:pStyle w:val="Heading2"/>
-      </w:pPr>
-      <w:r>
-        <w:t>対応場面</w:t>
-      </w:r>
-    </w:p>
-    <w:p>
-      <w:r>
-        <w:t>ブラジル人のお客様が「Quais documentos preciso para acionar o seguro de acidente?」と質問しており、事故原因、契約条件、必要書類、公的制度、民間保険、支払可否の違いを確認する場面。</w:t>
-      </w:r>
-    </w:p>
-    <w:p>
-      <w:pPr>
-        <w:pStyle w:val="Heading2"/>
-      </w:pPr>
-      <w:r>
-        <w:t>技術的回答</w:t>
-      </w:r>
-    </w:p>
-    <w:p>
-      <w:r>
-        <w:t>必要書類は、事故の種類、治療内容、契約条件、保険会社の請求手続きによって異なります。一般的には事故状況の説明、診断書または診療明細書、領収書、本人確認書類、保険会社指定の請求書類を確認します。不要な診断書費用を避けるため、先に保険会社の指定書類を確認することが重要です。</w:t>
-      </w:r>
-    </w:p>
-    <w:p>
-      <w:pPr>
-        <w:pStyle w:val="Heading2"/>
-      </w:pPr>
-      <w:r>
-        <w:t>ブラジル人顧客への回答</w:t>
-      </w:r>
-    </w:p>
-    <w:p>
-      <w:pPr>
-        <w:pStyle w:val="Heading3"/>
-      </w:pPr>
-      <w:r>
-        <w:t>PT-Br</w:t>
-      </w:r>
-    </w:p>
-    <w:p>
-      <w:r>
-        <w:t>Os documentos dependem do tipo de acidente e do contrato. Em geral, vamos confirmar relatório do acidente, documento médico, recibos, identificação e o formulário da seguradora antes de pedir documentos caros ao hospital.</w:t>
-      </w:r>
-    </w:p>
-    <w:p>
-      <w:pPr>
-        <w:pStyle w:val="Heading3"/>
-      </w:pPr>
-      <w:r>
-        <w:t>JP（ふりがな）</w:t>
-      </w:r>
-    </w:p>
-    <w:p>
-      <w:r>
-        <w:t>上記のポルトガル語は、お客様に対して、契約確認、書類確認、保険会社の査定が必要であることを短く伝えるための説明です。</w:t>
-      </w:r>
-    </w:p>
-    <w:p>
-      <w:r>
-        <w:t>ふりがな: けいやくかくにん、しょるいかくにん、ほけんがいしゃのさていがひつようであることを、みじかくつたえます。</w:t>
-      </w:r>
-    </w:p>
-    <w:p>
-      <w:pPr>
-        <w:pStyle w:val="Heading3"/>
-      </w:pPr>
-      <w:r>
-        <w:t>Leitura de apoio para o corretor</w:t>
-      </w:r>
-    </w:p>
-    <w:p>
-      <w:r>
-        <w:t>オス ドクメントス デペンデン ド チポ ジ アシデンチ イ ド コントラト。エン ジェラウ、ヴァモス コンフィルマール ヘラトリオ ド アシデンチ、ドクメント メジコ、ヘシボス、イデンチフィカサォン イ オ フォルムラリオ ダ セグラドーラ アンチス ジ ペジール ドクメントス カーロス アオ オスピタウ</w:t>
-      </w:r>
-    </w:p>
-    <w:p>
-      <w:pPr>
-        <w:pStyle w:val="Heading2"/>
-      </w:pPr>
-      <w:r>
-        <w:t>安全な次のステップ</w:t>
-      </w:r>
-    </w:p>
-    <w:p>
-      <w:r>
-        <w:t>保険証券、約款、事故日、事故原因、治療記録、診断書または診療明細書、領収書、保険会社指定の請求書類を確認してから案内する。</w:t>
-      </w:r>
-    </w:p>
-    <w:p>
-      <w:pPr>
-        <w:pStyle w:val="Heading2"/>
-      </w:pPr>
-      <w:r>
-        <w:t>コンプライアンス上の注意</w:t>
-      </w:r>
-    </w:p>
-    <w:p>
-      <w:r>
-        <w:t>補償、保険金支払い、労災保険の扱い、医療判断、法的判断、支払金額を断定しない。最終判断は契約条件、提出書類、事故状況、関連制度および保険会社の査定による。</w:t>
-      </w:r>
-    </w:p>
-    <w:p>
-      <w:pPr>
-        <w:pStyle w:val="Heading2"/>
-      </w:pPr>
-      <w:r>
-        <w:t>関連用語</w:t>
-      </w:r>
-    </w:p>
-    <w:p>
-      <w:pPr>
-        <w:pStyle w:val="ListBullet"/>
-      </w:pPr>
-      <w:r>
-        <w:t>ACC-0004 - 事故通知 - Aviso de acidente</w:t>
-      </w:r>
-    </w:p>
-    <w:p>
-      <w:pPr>
-        <w:pStyle w:val="ListBullet"/>
-      </w:pPr>
-      <w:r>
-        <w:t>ACC-0005 - 診断書 - Atestado médico</w:t>
-      </w:r>
-    </w:p>
-    <w:p>
-      <w:pPr>
-        <w:pStyle w:val="ListBullet"/>
-      </w:pPr>
-      <w:r>
-        <w:t>ACC-0006 - 診療明細書 - Detalhamento do atendimento médico</w:t>
-      </w:r>
-    </w:p>
-    <w:p>
-      <w:pPr>
-        <w:pStyle w:val="Heading2"/>
-      </w:pPr>
-      <w:r>
-        <w:t>相互参照</w:t>
-      </w:r>
-    </w:p>
-    <w:p>
-      <w:pPr>
-        <w:pStyle w:val="ListBullet"/>
-      </w:pPr>
-      <w:r>
-        <w:t>ACC-0004</w:t>
-      </w:r>
-    </w:p>
-    <w:p>
-      <w:pPr>
-        <w:pStyle w:val="ListBullet"/>
-      </w:pPr>
-      <w:r>
-        <w:t>ACC-0005</w:t>
-      </w:r>
-    </w:p>
-    <w:p>
-      <w:pPr>
-        <w:pStyle w:val="ListBullet"/>
-      </w:pPr>
-      <w:r>
-        <w:t>ACC-0006</w:t>
-      </w:r>
-    </w:p>
-    <w:p>
-      <w:pPr>
-        <w:pStyle w:val="ListBullet"/>
-      </w:pPr>
-      <w:r>
-        <w:t>FAQ-ACC-0004</w:t>
-      </w:r>
-    </w:p>
-    <w:p>
-      <w:pPr>
-        <w:pStyle w:val="Heading2"/>
-      </w:pPr>
-      <w:r>
-        <w:t>参考資料</w:t>
-      </w:r>
-    </w:p>
-    <w:p>
-      <w:pPr>
-        <w:pStyle w:val="ListBullet"/>
-      </w:pPr>
-      <w:r>
-        <w:t>Documento interno: `00_Project/multi_ai_pilot/ACC_FAQ_MULTI_AI_PILOT_REPORT_2026-06-29.md`</w:t>
-      </w:r>
-    </w:p>
-    <w:p>
-      <w:pPr>
-        <w:pStyle w:val="ListBullet"/>
-      </w:pPr>
-      <w:r>
-        <w:t>Fonte pública recomendada: 厚生労働省, 金融庁, 労働局, 保険会社の約款および請求書類</w:t>
-      </w:r>
-    </w:p>
-    <w:p>
-      <w:pPr>
-        <w:pStyle w:val="Heading2"/>
-      </w:pPr>
-      <w:r>
-        <w:t>タグ</w:t>
-      </w:r>
-    </w:p>
-    <w:p>
-      <w:pPr>
-        <w:pStyle w:val="ListBullet"/>
-      </w:pPr>
-      <w:r>
-        <w:t>faq</w:t>
-      </w:r>
-    </w:p>
-    <w:p>
-      <w:pPr>
-        <w:pStyle w:val="ListBullet"/>
-      </w:pPr>
-      <w:r>
-        <w:t>acc</w:t>
-      </w:r>
-    </w:p>
-    <w:p>
-      <w:pPr>
-        <w:pStyle w:val="ListBullet"/>
-      </w:pPr>
-      <w:r>
-        <w:t>atendimento</w:t>
-      </w:r>
-    </w:p>
-    <w:p>
-      <w:pPr>
-        <w:pStyle w:val="ListBullet"/>
-      </w:pPr>
-      <w:r>
-        <w:t>japanese-broker</w:t>
-      </w:r>
-    </w:p>
-    <w:p>
-      <w:pPr>
-        <w:pStyle w:val="ListBullet"/>
-      </w:pPr>
-      <w:r>
-        <w:t>compliance</w:t>
-      </w:r>
-    </w:p>
-    <w:p>
-      <w:pPr>
-        <w:pStyle w:val="Heading2"/>
-      </w:pPr>
-      <w:r>
-        <w:t>関連項目</w:t>
-      </w:r>
-    </w:p>
-    <w:p>
-      <w:pPr>
-        <w:pStyle w:val="ListBullet"/>
-      </w:pPr>
-      <w:r>
-        <w:t>`02_MasterDictionary/ACC/ACC-0001.md`</w:t>
-      </w:r>
-    </w:p>
-    <w:p>
-      <w:pPr>
-        <w:pStyle w:val="ListBullet"/>
-      </w:pPr>
-      <w:r>
-        <w:t>`00_Project/multi_ai_pilot/ACC_FAQ_MULTI_AI_PILOT_REPORT_2026-06-29.md`</w:t>
-      </w:r>
-    </w:p>
-    <w:p>
-      <w:pPr>
-        <w:pStyle w:val="Heading2"/>
-      </w:pPr>
-      <w:r>
-        <w:t>改訂履歴</w:t>
-      </w:r>
-    </w:p>
-    <w:p>
-      <w:r>
-        <w:t>| Data | Versão | Autor | Alteração |</w:t>
-      </w:r>
-    </w:p>
-    <w:p>
-      <w:r>
-        <w:t>| --- | --- | --- | --- |</w:t>
-      </w:r>
-    </w:p>
-    <w:p>
-      <w:r>
-        <w:t>| 2026-06-29 | 0.1 | JP-BR Insurance Knowledge Base | Criação inicial. |</w:t>
-      </w:r>
-    </w:p>
-    <w:p>
-      <w:r>
-        <w:t>---</w:t>
-      </w:r>
-    </w:p>
-    <w:p>
-      <w:pPr>
-        <w:pStyle w:val="Heading1"/>
-      </w:pPr>
-      <w:r>
-        <w:t>FAQ-ACC-0005 - 事故による入院はどのように説明しますか</w:t>
-      </w:r>
-    </w:p>
-    <w:p>
-      <w:pPr>
-        <w:pStyle w:val="Heading2"/>
-      </w:pPr>
-      <w:r>
-        <w:t>管理情報</w:t>
-      </w:r>
-    </w:p>
-    <w:p>
-      <w:pPr>
-        <w:pStyle w:val="ListBullet"/>
-      </w:pPr>
-      <w:r>
-        <w:t>Versão: 0.1</w:t>
-      </w:r>
-    </w:p>
-    <w:p>
-      <w:pPr>
-        <w:pStyle w:val="ListBullet"/>
-      </w:pPr>
-      <w:r>
-        <w:t>Data: 2026-06-29</w:t>
-      </w:r>
-    </w:p>
-    <w:p>
-      <w:pPr>
-        <w:pStyle w:val="ListBullet"/>
-      </w:pPr>
-      <w:r>
-        <w:t>Autor: JP-BR Insurance Knowledge Base</w:t>
-      </w:r>
-    </w:p>
-    <w:p>
-      <w:pPr>
-        <w:pStyle w:val="ListBullet"/>
-      </w:pPr>
-      <w:r>
-        <w:t>Histórico: Criação inicial a partir do piloto multi-IA ACC, com remoção de romaji e revisão de compliance.</w:t>
-      </w:r>
-    </w:p>
-    <w:p>
-      <w:pPr>
-        <w:pStyle w:val="Heading2"/>
-      </w:pPr>
-      <w:r>
-        <w:t>コード</w:t>
-      </w:r>
-    </w:p>
-    <w:p>
-      <w:r>
-        <w:t>FAQ-ACC-0005</w:t>
-      </w:r>
-    </w:p>
-    <w:p>
-      <w:pPr>
-        <w:pStyle w:val="Heading2"/>
-      </w:pPr>
-      <w:r>
-        <w:t>カテゴリー</w:t>
-      </w:r>
-    </w:p>
-    <w:p>
-      <w:r>
-        <w:t>ACC</w:t>
-      </w:r>
-    </w:p>
-    <w:p>
-      <w:pPr>
-        <w:pStyle w:val="Heading2"/>
-      </w:pPr>
-      <w:r>
-        <w:t>質問</w:t>
-      </w:r>
-    </w:p>
-    <w:p>
-      <w:r>
-        <w:t>事故による入院はどのように説明しますか</w:t>
-      </w:r>
-    </w:p>
-    <w:p>
-      <w:pPr>
-        <w:pStyle w:val="Heading2"/>
-      </w:pPr>
-      <w:r>
-        <w:t>日本語での自然な検索</w:t>
-      </w:r>
-    </w:p>
-    <w:p>
-      <w:pPr>
-        <w:pStyle w:val="ListBullet"/>
-      </w:pPr>
-      <w:r>
-        <w:t>事故による入院はどのように説明しますか</w:t>
-      </w:r>
-    </w:p>
-    <w:p>
-      <w:pPr>
-        <w:pStyle w:val="ListBullet"/>
-      </w:pPr>
-      <w:r>
-        <w:t>ブラジル人のお客様に事故保険をどう説明しますか。</w:t>
-      </w:r>
-    </w:p>
-    <w:p>
-      <w:pPr>
-        <w:pStyle w:val="ListBullet"/>
-      </w:pPr>
-      <w:r>
-        <w:t>傷害保険の相談で支払可否を断定しない説明はどうしますか。</w:t>
-      </w:r>
-    </w:p>
-    <w:p>
-      <w:pPr>
-        <w:pStyle w:val="Heading2"/>
-      </w:pPr>
-      <w:r>
-        <w:t>対応場面</w:t>
-      </w:r>
-    </w:p>
-    <w:p>
-      <w:r>
-        <w:t>ブラジル人のお客様が「Fui internado por causa de um acidente. O seguro pode ajudar?」と質問しており、事故原因、契約条件、必要書類、公的制度、民間保険、支払可否の違いを確認する場面。</w:t>
-      </w:r>
-    </w:p>
-    <w:p>
-      <w:pPr>
-        <w:pStyle w:val="Heading2"/>
-      </w:pPr>
-      <w:r>
-        <w:t>技術的回答</w:t>
-      </w:r>
-    </w:p>
-    <w:p>
-      <w:r>
-        <w:t>事故を原因とする入院は、契約上の入院保険金の確認対象となりえます。ただし、事故と入院の因果関係、対象となる病院、支払日数、免責日数、必要書類、契約上の限度を確認する必要があります。免責日数は、事故後の一定日数が支払対象外となる仕組みであり、加入直後の待機期間とは区別して説明します。</w:t>
-      </w:r>
-    </w:p>
-    <w:p>
-      <w:pPr>
-        <w:pStyle w:val="Heading2"/>
-      </w:pPr>
-      <w:r>
-        <w:t>ブラジル人顧客への回答</w:t>
-      </w:r>
-    </w:p>
-    <w:p>
-      <w:pPr>
-        <w:pStyle w:val="Heading3"/>
-      </w:pPr>
-      <w:r>
-        <w:t>PT-Br</w:t>
-      </w:r>
-    </w:p>
-    <w:p>
-      <w:r>
-        <w:t>Se a internação foi causada por acidente, o seguro pode ser analisado conforme o contrato. Vamos verificar o motivo da internação, os dias, a franquia temporal, os documentos e a decisão da seguradora.</w:t>
-      </w:r>
-    </w:p>
-    <w:p>
-      <w:pPr>
-        <w:pStyle w:val="Heading3"/>
-      </w:pPr>
-      <w:r>
-        <w:t>JP（ふりがな）</w:t>
-      </w:r>
-    </w:p>
-    <w:p>
-      <w:r>
-        <w:t>上記のポルトガル語は、お客様に対して、契約確認、書類確認、保険会社の査定が必要であることを短く伝えるための説明です。</w:t>
-      </w:r>
-    </w:p>
-    <w:p>
-      <w:r>
-        <w:t>ふりがな: けいやくかくにん、しょるいかくにん、ほけんがいしゃのさていがひつようであることを、みじかくつたえます。</w:t>
-      </w:r>
-    </w:p>
-    <w:p>
-      <w:pPr>
-        <w:pStyle w:val="Heading3"/>
-      </w:pPr>
-      <w:r>
-        <w:t>Leitura de apoio para o corretor</w:t>
+        <w:t>カタカナ読み</w:t>
       </w:r>
     </w:p>
     <w:p>
       <w:r>
         <w:t>セ ア インテルナサォン フォイ カウザーダ ポル アシデンチ、オ セグーロ ポジ セール アナリザード コンフォルミ オ コントラト。ヴァモス ヴェリフィカール オ モチーヴォ ダ インテルナサォン、オス ジアス、ア フランキア テンポラウ、オス ドクメントス イ ア デシザォン ダ セグラドーラ</w:t>
+      </w:r>
+    </w:p>
+    <w:p>
+      <w:r>
+        <w:t>日本語確認用: 上記のポルトガル語は、お客様に対して、契約確認、書類確認、保険会社の査定が必要であることを短く伝えるための説明です。</w:t>
       </w:r>
     </w:p>
     <w:p>

</xml_diff>

<commit_message>
Improve ACC customer-facing guidance
</commit_message>
<xml_diff>
--- a/18_DOCX/ACC_FAQ_0001_0005.docx
+++ b/18_DOCX/ACC_FAQ_0001_0005.docx
@@ -7,7 +7,7 @@
         <w:pStyle w:val="Heading1"/>
       </w:pPr>
       <w:r>
-        <w:t>ACC_FAQ_0001_0005 - ACCよくある質問</w:t>
+        <w:t>ACC_FAQ_0001_0005 - ACCよくある質問 0001-0005</w:t>
       </w:r>
     </w:p>
     <w:p>
@@ -23,7 +23,7 @@
         <w:pStyle w:val="ListBullet"/>
       </w:pPr>
       <w:r>
-        <w:t>Versão: 0.1</w:t>
+        <w:t>Versão: 0.2</w:t>
       </w:r>
     </w:p>
     <w:p>
@@ -47,7 +47,7 @@
         <w:pStyle w:val="ListBullet"/>
       </w:pPr>
       <w:r>
-        <w:t>Histórico: Consolidação inicial da categoria ACC a partir do piloto multi-IA revisado.</w:t>
+        <w:t>Histórico: Consolidação revisada após melhoria qualitativa de próximos passos em português e objeções de atendimento.</w:t>
       </w:r>
     </w:p>
     <w:p>
@@ -79,7 +79,7 @@
         <w:pStyle w:val="ListBullet"/>
       </w:pPr>
       <w:r>
-        <w:t>Versão: 0.1</w:t>
+        <w:t>Versão: 0.2</w:t>
       </w:r>
     </w:p>
     <w:p>
@@ -247,6 +247,79 @@
         <w:pStyle w:val="Heading2"/>
       </w:pPr>
       <w:r>
+        <w:t>顧客への次の一言</w:t>
+      </w:r>
+    </w:p>
+    <w:p>
+      <w:pPr>
+        <w:pStyle w:val="Heading3"/>
+      </w:pPr>
+      <w:r>
+        <w:t>ポルトガル語で伝える内容</w:t>
+      </w:r>
+    </w:p>
+    <w:p>
+      <w:r>
+        <w:t>Agora me confirme se você já avisou a empresa e me envie os documentos do atendimento médico.</w:t>
+      </w:r>
+    </w:p>
+    <w:p>
+      <w:pPr>
+        <w:pStyle w:val="Heading3"/>
+      </w:pPr>
+      <w:r>
+        <w:t>カタカナ読み</w:t>
+      </w:r>
+    </w:p>
+    <w:p>
+      <w:r>
+        <w:t>アゴラ ミ コンフィルミ セ ヴォセ ジャ アヴィゾウ ア エンプレーザ イ ミ エンヴィエ オス ドクメントス ド アテンジメント メジコ</w:t>
+      </w:r>
+    </w:p>
+    <w:p>
+      <w:r>
+        <w:t>日本語確認用: 顧客に次の具体的な行動を短く案内する。</w:t>
+      </w:r>
+    </w:p>
+    <w:p>
+      <w:pPr>
+        <w:pStyle w:val="Heading2"/>
+      </w:pPr>
+      <w:r>
+        <w:t>想定される反論</w:t>
+      </w:r>
+    </w:p>
+    <w:p>
+      <w:pPr>
+        <w:pStyle w:val="Heading3"/>
+      </w:pPr>
+      <w:r>
+        <w:t>顧客が言いそうなこと</w:t>
+      </w:r>
+    </w:p>
+    <w:p>
+      <w:r>
+        <w:t>Mas eu já pago seguro, por que não cobre automaticamente?</w:t>
+      </w:r>
+    </w:p>
+    <w:p>
+      <w:pPr>
+        <w:pStyle w:val="Heading3"/>
+      </w:pPr>
+      <w:r>
+        <w:t>安全なポルトガル語回答</w:t>
+      </w:r>
+    </w:p>
+    <w:p>
+      <w:r>
+        <w:t>Mesmo pagando o seguro, a seguradora precisa confirmar se este acidente entra no contrato e se também existe procedimento com a empresa.</w:t>
+      </w:r>
+    </w:p>
+    <w:p>
+      <w:pPr>
+        <w:pStyle w:val="Heading2"/>
+      </w:pPr>
+      <w:r>
         <w:t>安全な次のステップ</w:t>
       </w:r>
     </w:p>
@@ -477,7 +550,7 @@
     </w:p>
     <w:p>
       <w:r>
-        <w:t>---</w:t>
+        <w:t>| 2026-06-29 | 0.2 | JP-BR Insurance Knowledge Base | Inclusão de próximo passo em português e objeção provável. |</w:t>
       </w:r>
     </w:p>
     <w:p>
@@ -501,7 +574,7 @@
         <w:pStyle w:val="ListBullet"/>
       </w:pPr>
       <w:r>
-        <w:t>Versão: 0.1</w:t>
+        <w:t>Versão: 0.2</w:t>
       </w:r>
     </w:p>
     <w:p>
@@ -669,6 +742,79 @@
         <w:pStyle w:val="Heading2"/>
       </w:pPr>
       <w:r>
+        <w:t>顧客への次の一言</w:t>
+      </w:r>
+    </w:p>
+    <w:p>
+      <w:pPr>
+        <w:pStyle w:val="Heading3"/>
+      </w:pPr>
+      <w:r>
+        <w:t>ポルトガル語で伝える内容</w:t>
+      </w:r>
+    </w:p>
+    <w:p>
+      <w:r>
+        <w:t>Vamos separar o que é tratamento médico e o que é benefício por acidente antes de falar sobre pagamento.</w:t>
+      </w:r>
+    </w:p>
+    <w:p>
+      <w:pPr>
+        <w:pStyle w:val="Heading3"/>
+      </w:pPr>
+      <w:r>
+        <w:t>カタカナ読み</w:t>
+      </w:r>
+    </w:p>
+    <w:p>
+      <w:r>
+        <w:t>ヴァモス セパラール オ キ エ トラタメント メジコ イ オ キ エ ベネフィシオ ポル アシデンチ アンチス ジ ファラール ソブリ パガメント</w:t>
+      </w:r>
+    </w:p>
+    <w:p>
+      <w:r>
+        <w:t>日本語確認用: 顧客に次の具体的な行動を短く案内する。</w:t>
+      </w:r>
+    </w:p>
+    <w:p>
+      <w:pPr>
+        <w:pStyle w:val="Heading2"/>
+      </w:pPr>
+      <w:r>
+        <w:t>想定される反論</w:t>
+      </w:r>
+    </w:p>
+    <w:p>
+      <w:pPr>
+        <w:pStyle w:val="Heading3"/>
+      </w:pPr>
+      <w:r>
+        <w:t>顧客が言いそうなこと</w:t>
+      </w:r>
+    </w:p>
+    <w:p>
+      <w:r>
+        <w:t>Seguro médico e seguro de acidente não são a mesma coisa?</w:t>
+      </w:r>
+    </w:p>
+    <w:p>
+      <w:pPr>
+        <w:pStyle w:val="Heading3"/>
+      </w:pPr>
+      <w:r>
+        <w:t>安全なポルトガル語回答</w:t>
+      </w:r>
+    </w:p>
+    <w:p>
+      <w:r>
+        <w:t>Eles podem parecer parecidos, mas têm regras diferentes. Um olha tratamento de saúde; o outro olha acidente e contrato específico.</w:t>
+      </w:r>
+    </w:p>
+    <w:p>
+      <w:pPr>
+        <w:pStyle w:val="Heading2"/>
+      </w:pPr>
+      <w:r>
         <w:t>安全な次のステップ</w:t>
       </w:r>
     </w:p>
@@ -867,7 +1013,7 @@
     </w:p>
     <w:p>
       <w:r>
-        <w:t>---</w:t>
+        <w:t>| 2026-06-29 | 0.2 | JP-BR Insurance Knowledge Base | Inclusão de próximo passo em português e objeção provável. |</w:t>
       </w:r>
     </w:p>
     <w:p>
@@ -891,7 +1037,7 @@
         <w:pStyle w:val="ListBullet"/>
       </w:pPr>
       <w:r>
-        <w:t>Versão: 0.1</w:t>
+        <w:t>Versão: 0.2</w:t>
       </w:r>
     </w:p>
     <w:p>
@@ -1059,6 +1205,79 @@
         <w:pStyle w:val="Heading2"/>
       </w:pPr>
       <w:r>
+        <w:t>顧客への次の一言</w:t>
+      </w:r>
+    </w:p>
+    <w:p>
+      <w:pPr>
+        <w:pStyle w:val="Heading3"/>
+      </w:pPr>
+      <w:r>
+        <w:t>ポルトガル語で伝える内容</w:t>
+      </w:r>
+    </w:p>
+    <w:p>
+      <w:r>
+        <w:t>Envie o documento do hospital com o diagnóstico e a data do acidente para verificarmos o pedido correto.</w:t>
+      </w:r>
+    </w:p>
+    <w:p>
+      <w:pPr>
+        <w:pStyle w:val="Heading3"/>
+      </w:pPr>
+      <w:r>
+        <w:t>カタカナ読み</w:t>
+      </w:r>
+    </w:p>
+    <w:p>
+      <w:r>
+        <w:t>エンヴィエ オ ドクメント ド オスピタウ コム オ ジアグノスチコ イ ア ダタ ド アシデンチ パラ ヴェリフィカルモス オ ペジード コヘト</w:t>
+      </w:r>
+    </w:p>
+    <w:p>
+      <w:r>
+        <w:t>日本語確認用: 顧客に次の具体的な行動を短く案内する。</w:t>
+      </w:r>
+    </w:p>
+    <w:p>
+      <w:pPr>
+        <w:pStyle w:val="Heading2"/>
+      </w:pPr>
+      <w:r>
+        <w:t>想定される反論</w:t>
+      </w:r>
+    </w:p>
+    <w:p>
+      <w:pPr>
+        <w:pStyle w:val="Heading3"/>
+      </w:pPr>
+      <w:r>
+        <w:t>顧客が言いそうなこと</w:t>
+      </w:r>
+    </w:p>
+    <w:p>
+      <w:r>
+        <w:t>Fratura sempre recebe pagamento?</w:t>
+      </w:r>
+    </w:p>
+    <w:p>
+      <w:pPr>
+        <w:pStyle w:val="Heading3"/>
+      </w:pPr>
+      <w:r>
+        <w:t>安全なポルトガル語回答</w:t>
+      </w:r>
+    </w:p>
+    <w:p>
+      <w:r>
+        <w:t>Não posso afirmar sempre. Precisamos confirmar o contrato, a causa da fratura e os documentos médicos.</w:t>
+      </w:r>
+    </w:p>
+    <w:p>
+      <w:pPr>
+        <w:pStyle w:val="Heading2"/>
+      </w:pPr>
+      <w:r>
         <w:t>安全な次のステップ</w:t>
       </w:r>
     </w:p>
@@ -1289,7 +1508,7 @@
     </w:p>
     <w:p>
       <w:r>
-        <w:t>---</w:t>
+        <w:t>| 2026-06-29 | 0.2 | JP-BR Insurance Knowledge Base | Inclusão de próximo passo em português e objeção provável. |</w:t>
       </w:r>
     </w:p>
     <w:p>
@@ -1313,7 +1532,7 @@
         <w:pStyle w:val="ListBullet"/>
       </w:pPr>
       <w:r>
-        <w:t>Versão: 0.1</w:t>
+        <w:t>Versão: 0.2</w:t>
       </w:r>
     </w:p>
     <w:p>
@@ -1481,6 +1700,79 @@
         <w:pStyle w:val="Heading2"/>
       </w:pPr>
       <w:r>
+        <w:t>顧客への次の一言</w:t>
+      </w:r>
+    </w:p>
+    <w:p>
+      <w:pPr>
+        <w:pStyle w:val="Heading3"/>
+      </w:pPr>
+      <w:r>
+        <w:t>ポルトガル語で伝える内容</w:t>
+      </w:r>
+    </w:p>
+    <w:p>
+      <w:r>
+        <w:t>Por favor, junte a apólice, o documento do hospital, recibos e qualquer informação sobre o acidente.</w:t>
+      </w:r>
+    </w:p>
+    <w:p>
+      <w:pPr>
+        <w:pStyle w:val="Heading3"/>
+      </w:pPr>
+      <w:r>
+        <w:t>カタカナ読み</w:t>
+      </w:r>
+    </w:p>
+    <w:p>
+      <w:r>
+        <w:t>ポル ファヴォール、ジュンチ ア アポリセ、オ ドクメント ド オスピタウ、ヘシーボス イ クアルケール インフォルマサォン ソブリ オ アシデンチ</w:t>
+      </w:r>
+    </w:p>
+    <w:p>
+      <w:r>
+        <w:t>日本語確認用: 顧客に次の具体的な行動を短く案内する。</w:t>
+      </w:r>
+    </w:p>
+    <w:p>
+      <w:pPr>
+        <w:pStyle w:val="Heading2"/>
+      </w:pPr>
+      <w:r>
+        <w:t>想定される反論</w:t>
+      </w:r>
+    </w:p>
+    <w:p>
+      <w:pPr>
+        <w:pStyle w:val="Heading3"/>
+      </w:pPr>
+      <w:r>
+        <w:t>顧客が言いそうなこと</w:t>
+      </w:r>
+    </w:p>
+    <w:p>
+      <w:r>
+        <w:t>Não tenho todos os documentos agora. Perdi o direito?</w:t>
+      </w:r>
+    </w:p>
+    <w:p>
+      <w:pPr>
+        <w:pStyle w:val="Heading3"/>
+      </w:pPr>
+      <w:r>
+        <w:t>安全なポルトガル語回答</w:t>
+      </w:r>
+    </w:p>
+    <w:p>
+      <w:r>
+        <w:t>Não necessariamente. Vamos ver o que você já tem e confirmar com a seguradora quais documentos faltam.</w:t>
+      </w:r>
+    </w:p>
+    <w:p>
+      <w:pPr>
+        <w:pStyle w:val="Heading2"/>
+      </w:pPr>
+      <w:r>
         <w:t>安全な次のステップ</w:t>
       </w:r>
     </w:p>
@@ -1695,7 +1987,7 @@
     </w:p>
     <w:p>
       <w:r>
-        <w:t>---</w:t>
+        <w:t>| 2026-06-29 | 0.2 | JP-BR Insurance Knowledge Base | Inclusão de próximo passo em português e objeção provável. |</w:t>
       </w:r>
     </w:p>
     <w:p>
@@ -1719,7 +2011,7 @@
         <w:pStyle w:val="ListBullet"/>
       </w:pPr>
       <w:r>
-        <w:t>Versão: 0.1</w:t>
+        <w:t>Versão: 0.2</w:t>
       </w:r>
     </w:p>
     <w:p>
@@ -1887,6 +2179,79 @@
         <w:pStyle w:val="Heading2"/>
       </w:pPr>
       <w:r>
+        <w:t>顧客への次の一言</w:t>
+      </w:r>
+    </w:p>
+    <w:p>
+      <w:pPr>
+        <w:pStyle w:val="Heading3"/>
+      </w:pPr>
+      <w:r>
+        <w:t>ポルトガル語で伝える内容</w:t>
+      </w:r>
+    </w:p>
+    <w:p>
+      <w:r>
+        <w:t>Me envie as datas de entrada e saída do hospital para conferirmos os dias pelo contrato.</w:t>
+      </w:r>
+    </w:p>
+    <w:p>
+      <w:pPr>
+        <w:pStyle w:val="Heading3"/>
+      </w:pPr>
+      <w:r>
+        <w:t>カタカナ読み</w:t>
+      </w:r>
+    </w:p>
+    <w:p>
+      <w:r>
+        <w:t>ミ エンヴィエ アス ダタス ジ エントラーダ イ サイーダ ド オスピタウ パラ コンフェリルモス オス ジアス ペロ コントラト</w:t>
+      </w:r>
+    </w:p>
+    <w:p>
+      <w:r>
+        <w:t>日本語確認用: 顧客に次の具体的な行動を短く案内する。</w:t>
+      </w:r>
+    </w:p>
+    <w:p>
+      <w:pPr>
+        <w:pStyle w:val="Heading2"/>
+      </w:pPr>
+      <w:r>
+        <w:t>想定される反論</w:t>
+      </w:r>
+    </w:p>
+    <w:p>
+      <w:pPr>
+        <w:pStyle w:val="Heading3"/>
+      </w:pPr>
+      <w:r>
+        <w:t>顧客が言いそうなこと</w:t>
+      </w:r>
+    </w:p>
+    <w:p>
+      <w:r>
+        <w:t>Fiquei internado, então todos os dias serão pagos?</w:t>
+      </w:r>
+    </w:p>
+    <w:p>
+      <w:pPr>
+        <w:pStyle w:val="Heading3"/>
+      </w:pPr>
+      <w:r>
+        <w:t>安全なポルトガル語回答</w:t>
+      </w:r>
+    </w:p>
+    <w:p>
+      <w:r>
+        <w:t>Pode ser diferente. O contrato pode ter limite, franquia em dias ou outras condições.</w:t>
+      </w:r>
+    </w:p>
+    <w:p>
+      <w:pPr>
+        <w:pStyle w:val="Heading2"/>
+      </w:pPr>
+      <w:r>
         <w:t>安全な次のステップ</w:t>
       </w:r>
     </w:p>
@@ -2117,7 +2482,7 @@
     </w:p>
     <w:p>
       <w:r>
-        <w:t>---</w:t>
+        <w:t>| 2026-06-29 | 0.2 | JP-BR Insurance Knowledge Base | Inclusão de próximo passo em português e objeção provável. |</w:t>
       </w:r>
     </w:p>
     <w:sectPr>
@@ -2609,7 +2974,7 @@
       <w:b/>
       <w:bCs/>
       <w:color w:val="4F81BD" w:themeColor="accent1"/>
-      <w:sz w:val="26"/>
+      <w:sz w:val="22"/>
     </w:rPr>
   </w:style>
   <w:style w:type="paragraph" w:styleId="Heading4">
@@ -2629,12 +2994,13 @@
       <w:outlineLvl w:val="3"/>
     </w:pPr>
     <w:rPr>
-      <w:rFonts w:asciiTheme="majorHAnsi" w:eastAsiaTheme="majorEastAsia" w:hAnsiTheme="majorHAnsi" w:cstheme="majorBidi"/>
+      <w:rFonts w:asciiTheme="majorHAnsi" w:eastAsiaTheme="majorEastAsia" w:hAnsiTheme="majorHAnsi" w:cstheme="majorBidi" w:ascii="Noto Sans CJK JP" w:hAnsi="Noto Sans CJK JP" w:eastAsia="Noto Sans CJK JP"/>
       <w:b/>
       <w:bCs/>
       <w:i/>
       <w:iCs/>
       <w:color w:val="4F81BD" w:themeColor="accent1"/>
+      <w:sz w:val="22"/>
     </w:rPr>
   </w:style>
   <w:style w:type="paragraph" w:styleId="Heading5">

</xml_diff>